<commit_message>
Phase 3 & 4: Add Ray compute workers and real-time Django dashboard
Phase 3 - Distributed Compute (Ray Workers):
- CongestionAnalyzer: EMA-smoothed congestion scoring per intersection
- HeatmapGenerator: Gaussian-smoothed heatmap matrix generation
- RouteOptimizer: Global EV route optimization with conflict avoidance
- EmergencyCorridor: Green-wave signal corridor computation
- TrafficPredictor: Double exponential smoothing for forecasting
- Multi-topic Kafka consumer with batch dispatching
- FastAPI health endpoint on port 8006

Phase 4 - Real-Time Dashboard (Django Channels):
- WebSocket consumers for traffic, heatmap, alerts, EV tracking
- Redis Pub/Sub integration for live data streaming
- Premium dark theme with glassmorphism design
- Canvas-rendered congestion heatmap
- Live 4x4 traffic grid with signal lights
- EV fleet tracker with battery status
- Emergency alerts feed with auto-clear
- Service health monitoring panel
- Auto-reconnect WebSocket manager
</commit_message>
<xml_diff>
--- a/project.docx
+++ b/project.docx
@@ -14,37 +14,144 @@
           <w:b/>
           <w:bCs/>
         </w:rPr>
-        <w:t>Yes — these refinements are genuinely good engineering decisions.</w:t>
-      </w:r>
-      <w:r>
-        <w:rPr>
-          <w:b/>
-          <w:bCs/>
-        </w:rPr>
-        <w:br/>
-        <w:t>They are not removing complexity in a “weakening the project” way.</w:t>
-      </w:r>
-    </w:p>
-    <w:p>
-      <w:pPr>
-        <w:rPr>
-          <w:b/>
-          <w:bCs/>
-        </w:rPr>
-      </w:pPr>
-      <w:r>
-        <w:rPr>
-          <w:b/>
-          <w:bCs/>
-        </w:rPr>
-        <w:t>They are:</w:t>
+        <w:t xml:space="preserve">At its core, </w:t>
+      </w:r>
+      <w:proofErr w:type="spellStart"/>
+      <w:r>
+        <w:rPr>
+          <w:b/>
+          <w:bCs/>
+        </w:rPr>
+        <w:t>EdgeCloudX</w:t>
+      </w:r>
+      <w:proofErr w:type="spellEnd"/>
+      <w:r>
+        <w:rPr>
+          <w:b/>
+          <w:bCs/>
+        </w:rPr>
+        <w:t xml:space="preserve"> is the digital brain for a futuristic, self-driving "Smart City."</w:t>
+      </w:r>
+    </w:p>
+    <w:p>
+      <w:pPr>
+        <w:rPr>
+          <w:b/>
+          <w:bCs/>
+        </w:rPr>
+      </w:pPr>
+      <w:r>
+        <w:rPr>
+          <w:b/>
+          <w:bCs/>
+        </w:rPr>
+        <w:t>Instead of relying on "dumb" traffic lights that just change on a fixed timer, this project aims to create a city infrastructure that can see, think, and react to what is happening on the streets in real-time.</w:t>
+      </w:r>
+    </w:p>
+    <w:p>
+      <w:pPr>
+        <w:rPr>
+          <w:b/>
+          <w:bCs/>
+        </w:rPr>
+      </w:pPr>
+      <w:r>
+        <w:rPr>
+          <w:b/>
+          <w:bCs/>
+        </w:rPr>
+        <w:t>Here is the story of what this system is actually doing conceptually:</w:t>
+      </w:r>
+    </w:p>
+    <w:p>
+      <w:pPr>
+        <w:rPr>
+          <w:b/>
+          <w:bCs/>
+        </w:rPr>
+      </w:pPr>
+      <w:r>
+        <w:rPr>
+          <w:b/>
+          <w:bCs/>
+        </w:rPr>
+        <w:t>The Problem It Solves</w:t>
+      </w:r>
+    </w:p>
+    <w:p>
+      <w:pPr>
+        <w:rPr>
+          <w:b/>
+          <w:bCs/>
+        </w:rPr>
+      </w:pPr>
+      <w:r>
+        <w:rPr>
+          <w:b/>
+          <w:bCs/>
+        </w:rPr>
+        <w:t>In a traditional city, if a massive traffic jam happens or an ambulance needs to get to a hospital, the infrastructure doesn't adapt. Cars sit idling, wasting energy, and emergency vehicles get stuck.</w:t>
+      </w:r>
+    </w:p>
+    <w:p>
+      <w:pPr>
+        <w:rPr>
+          <w:b/>
+          <w:bCs/>
+        </w:rPr>
+      </w:pPr>
+      <w:proofErr w:type="spellStart"/>
+      <w:r>
+        <w:rPr>
+          <w:b/>
+          <w:bCs/>
+        </w:rPr>
+        <w:t>EdgeCloudX</w:t>
+      </w:r>
+      <w:proofErr w:type="spellEnd"/>
+      <w:r>
+        <w:rPr>
+          <w:b/>
+          <w:bCs/>
+        </w:rPr>
+        <w:t xml:space="preserve"> fixes this by making the city grid fully autonomous and reactive.</w:t>
+      </w:r>
+    </w:p>
+    <w:p>
+      <w:pPr>
+        <w:rPr>
+          <w:b/>
+          <w:bCs/>
+        </w:rPr>
+      </w:pPr>
+      <w:r>
+        <w:rPr>
+          <w:b/>
+          <w:bCs/>
+        </w:rPr>
+        <w:t>How It Works in Practice</w:t>
+      </w:r>
+    </w:p>
+    <w:p>
+      <w:pPr>
+        <w:rPr>
+          <w:b/>
+          <w:bCs/>
+        </w:rPr>
+      </w:pPr>
+      <w:r>
+        <w:rPr>
+          <w:b/>
+          <w:bCs/>
+        </w:rPr>
+        <w:t>Imagine a busy intersection in the city running on your system:</w:t>
       </w:r>
     </w:p>
     <w:p>
       <w:pPr>
         <w:numPr>
           <w:ilvl w:val="0"/>
-          <w:numId w:val="19"/>
+          <w:numId w:val="43"/>
         </w:numPr>
         <w:rPr>
           <w:b/>
@@ -56,14 +163,46 @@
           <w:b/>
           <w:bCs/>
         </w:rPr>
-        <w:t>removing unnecessary architectural friction,</w:t>
+        <w:t xml:space="preserve">The Eyes (Edge AI Nodes): Traffic cameras (your YOLOv8 detector or simulator) watch the intersection. They count the cars and notice that the </w:t>
+      </w:r>
+      <w:proofErr w:type="gramStart"/>
+      <w:r>
+        <w:rPr>
+          <w:b/>
+          <w:bCs/>
+        </w:rPr>
+        <w:t>Northbound lane</w:t>
+      </w:r>
+      <w:proofErr w:type="gramEnd"/>
+      <w:r>
+        <w:rPr>
+          <w:b/>
+          <w:bCs/>
+        </w:rPr>
+        <w:t xml:space="preserve"> is backed up, while the </w:t>
+      </w:r>
+      <w:proofErr w:type="gramStart"/>
+      <w:r>
+        <w:rPr>
+          <w:b/>
+          <w:bCs/>
+        </w:rPr>
+        <w:t>Eastbound lane</w:t>
+      </w:r>
+      <w:proofErr w:type="gramEnd"/>
+      <w:r>
+        <w:rPr>
+          <w:b/>
+          <w:bCs/>
+        </w:rPr>
+        <w:t xml:space="preserve"> is empty.</w:t>
       </w:r>
     </w:p>
     <w:p>
       <w:pPr>
         <w:numPr>
           <w:ilvl w:val="0"/>
-          <w:numId w:val="19"/>
+          <w:numId w:val="43"/>
         </w:numPr>
         <w:rPr>
           <w:b/>
@@ -75,14 +214,14 @@
           <w:b/>
           <w:bCs/>
         </w:rPr>
-        <w:t>making the system more realistic,</w:t>
+        <w:t>The Nervous System (Kafka &amp; Redis): These cameras instantly stream this observation to the central servers without any delay.</w:t>
       </w:r>
     </w:p>
     <w:p>
       <w:pPr>
         <w:numPr>
           <w:ilvl w:val="0"/>
-          <w:numId w:val="19"/>
+          <w:numId w:val="43"/>
         </w:numPr>
         <w:rPr>
           <w:b/>
@@ -94,38 +233,222 @@
           <w:b/>
           <w:bCs/>
         </w:rPr>
-        <w:t>and improving implementation feasibility.</w:t>
-      </w:r>
-    </w:p>
-    <w:p>
-      <w:pPr>
-        <w:rPr>
-          <w:b/>
-          <w:bCs/>
-        </w:rPr>
-      </w:pPr>
-      <w:r>
-        <w:rPr>
-          <w:b/>
-          <w:bCs/>
-        </w:rPr>
-        <w:t>That is exactly what senior engineers do.</w:t>
-      </w:r>
-    </w:p>
-    <w:p>
-      <w:pPr>
-        <w:rPr>
-          <w:b/>
-          <w:bCs/>
-        </w:rPr>
-      </w:pPr>
-      <w:r>
-        <w:rPr>
-          <w:b/>
-          <w:bCs/>
-        </w:rPr>
-        <w:pict w14:anchorId="042C813F">
-          <v:rect id="_x0000_i1264" style="width:0;height:1.5pt" o:hralign="center" o:hrstd="t" o:hr="t" fillcolor="#a0a0a0" stroked="f"/>
+        <w:t>The Brain (Traffic &amp; Analytics Services): The system calculates the congestion level and makes an immediate decision to keep the Northbound light green longer to clear the jam.</w:t>
+      </w:r>
+    </w:p>
+    <w:p>
+      <w:pPr>
+        <w:numPr>
+          <w:ilvl w:val="0"/>
+          <w:numId w:val="43"/>
+        </w:numPr>
+        <w:rPr>
+          <w:b/>
+          <w:bCs/>
+        </w:rPr>
+      </w:pPr>
+      <w:r>
+        <w:rPr>
+          <w:b/>
+          <w:bCs/>
+        </w:rPr>
+        <w:t>The Lifeline (Alert &amp; Routing Services): If one of the vehicles is an ambulance, the system calculates the fastest path to the hospital (using the A* algorithm) and forces a "green corridor"—turning every light green in front of the ambulance before it even arrives.</w:t>
+      </w:r>
+    </w:p>
+    <w:p>
+      <w:pPr>
+        <w:rPr>
+          <w:b/>
+          <w:bCs/>
+        </w:rPr>
+      </w:pPr>
+      <w:r>
+        <w:rPr>
+          <w:b/>
+          <w:bCs/>
+        </w:rPr>
+        <w:t>The Bigger Picture</w:t>
+      </w:r>
+    </w:p>
+    <w:p>
+      <w:pPr>
+        <w:rPr>
+          <w:b/>
+          <w:bCs/>
+        </w:rPr>
+      </w:pPr>
+      <w:r>
+        <w:rPr>
+          <w:b/>
+          <w:bCs/>
+        </w:rPr>
+        <w:t xml:space="preserve">Beyond just managing traffic lights, the system acts as a massive testing ground for modern transportation. Because you built an EV Fleet Simulator directly into it, this grid acts as the perfect environment to test algorithms for an adaptive energy-efficient navigation system research project for electric vehicles. You can simulate exactly how traffic patterns impact battery </w:t>
+      </w:r>
+      <w:proofErr w:type="gramStart"/>
+      <w:r>
+        <w:rPr>
+          <w:b/>
+          <w:bCs/>
+        </w:rPr>
+        <w:t>drain</w:t>
+      </w:r>
+      <w:proofErr w:type="gramEnd"/>
+      <w:r>
+        <w:rPr>
+          <w:b/>
+          <w:bCs/>
+        </w:rPr>
+        <w:t xml:space="preserve"> and routing logic at scale.</w:t>
+      </w:r>
+    </w:p>
+    <w:p>
+      <w:pPr>
+        <w:rPr>
+          <w:b/>
+          <w:bCs/>
+        </w:rPr>
+      </w:pPr>
+      <w:r>
+        <w:rPr>
+          <w:b/>
+          <w:bCs/>
+        </w:rPr>
+        <w:t xml:space="preserve">Ultimately, this project is a heavyweight demonstration of enterprise-level system design. Building a distributed, event-driven architecture of this magnitude showcases a level of engineering maturity that builds substantially upon foundational experiences like a two-month software engineering internship at </w:t>
+      </w:r>
+      <w:proofErr w:type="spellStart"/>
+      <w:r>
+        <w:rPr>
+          <w:b/>
+          <w:bCs/>
+        </w:rPr>
+        <w:t>YugaYatra</w:t>
+      </w:r>
+      <w:proofErr w:type="spellEnd"/>
+      <w:r>
+        <w:rPr>
+          <w:b/>
+          <w:bCs/>
+        </w:rPr>
+        <w:t xml:space="preserve">. It proves you can build the kind of </w:t>
+      </w:r>
+      <w:r>
+        <w:rPr>
+          <w:b/>
+          <w:bCs/>
+        </w:rPr>
+        <w:lastRenderedPageBreak/>
+        <w:t>infrastructure that massive tech companies rely on to process millions of events per second.</w:t>
+      </w:r>
+    </w:p>
+    <w:p>
+      <w:pPr>
+        <w:rPr>
+          <w:b/>
+          <w:bCs/>
+        </w:rPr>
+      </w:pPr>
+    </w:p>
+    <w:p>
+      <w:pPr>
+        <w:rPr>
+          <w:b/>
+          <w:bCs/>
+        </w:rPr>
+      </w:pPr>
+    </w:p>
+    <w:p>
+      <w:pPr>
+        <w:rPr>
+          <w:b/>
+          <w:bCs/>
+        </w:rPr>
+      </w:pPr>
+    </w:p>
+    <w:p>
+      <w:pPr>
+        <w:rPr>
+          <w:b/>
+          <w:bCs/>
+        </w:rPr>
+      </w:pPr>
+    </w:p>
+    <w:p>
+      <w:pPr>
+        <w:rPr>
+          <w:b/>
+          <w:bCs/>
+        </w:rPr>
+      </w:pPr>
+    </w:p>
+    <w:p>
+      <w:pPr>
+        <w:rPr>
+          <w:b/>
+          <w:bCs/>
+        </w:rPr>
+      </w:pPr>
+    </w:p>
+    <w:p>
+      <w:pPr>
+        <w:rPr>
+          <w:b/>
+          <w:bCs/>
+        </w:rPr>
+      </w:pPr>
+    </w:p>
+    <w:p>
+      <w:pPr>
+        <w:rPr>
+          <w:b/>
+          <w:bCs/>
+        </w:rPr>
+      </w:pPr>
+      <w:r>
+        <w:rPr>
+          <w:b/>
+          <w:bCs/>
+        </w:rPr>
+        <w:t>ARCHITECTURE</w:t>
+      </w:r>
+    </w:p>
+    <w:p>
+      <w:pPr>
+        <w:rPr>
+          <w:b/>
+          <w:bCs/>
+        </w:rPr>
+      </w:pPr>
+      <w:proofErr w:type="spellStart"/>
+      <w:r>
+        <w:rPr>
+          <w:b/>
+          <w:bCs/>
+        </w:rPr>
+        <w:t>EdgeCloudX</w:t>
+      </w:r>
+      <w:proofErr w:type="spellEnd"/>
+      <w:r>
+        <w:rPr>
+          <w:b/>
+          <w:bCs/>
+        </w:rPr>
+        <w:t xml:space="preserve"> — Autonomous Smart City Grid</w:t>
+      </w:r>
+    </w:p>
+    <w:p>
+      <w:pPr>
+        <w:rPr>
+          <w:b/>
+          <w:bCs/>
+        </w:rPr>
+      </w:pPr>
+      <w:r>
+        <w:rPr>
+          <w:b/>
+          <w:bCs/>
+        </w:rPr>
+        <w:pict w14:anchorId="3A66F0F4">
+          <v:rect id="_x0000_i1025" style="width:0;height:1.5pt" o:hralign="center" o:hrstd="t" o:hr="t" fillcolor="#a0a0a0" stroked="f"/>
         </w:pict>
       </w:r>
     </w:p>
@@ -141,69 +464,7 @@
           <w:b/>
           <w:bCs/>
         </w:rPr>
-        <w:t>FINAL UPGRADED ARCHITECTURE</w:t>
-      </w:r>
-    </w:p>
-    <w:p>
-      <w:pPr>
-        <w:rPr>
-          <w:b/>
-          <w:bCs/>
-        </w:rPr>
-      </w:pPr>
-      <w:r>
-        <w:rPr>
-          <w:b/>
-          <w:bCs/>
-        </w:rPr>
-        <w:t>EdgeCloudX — Autonomous Smart City Grid</w:t>
-      </w:r>
-    </w:p>
-    <w:p>
-      <w:pPr>
-        <w:rPr>
-          <w:b/>
-          <w:bCs/>
-        </w:rPr>
-      </w:pPr>
-      <w:r>
-        <w:rPr>
-          <w:b/>
-          <w:bCs/>
-        </w:rPr>
-        <w:t>This is now the finalized architecture we should build.</w:t>
-      </w:r>
-    </w:p>
-    <w:p>
-      <w:pPr>
-        <w:rPr>
-          <w:b/>
-          <w:bCs/>
-        </w:rPr>
-      </w:pPr>
-      <w:r>
-        <w:rPr>
-          <w:b/>
-          <w:bCs/>
-        </w:rPr>
-        <w:pict w14:anchorId="3A66F0F4">
-          <v:rect id="_x0000_i1265" style="width:0;height:1.5pt" o:hralign="center" o:hrstd="t" o:hr="t" fillcolor="#a0a0a0" stroked="f"/>
-        </w:pict>
-      </w:r>
-    </w:p>
-    <w:p>
-      <w:pPr>
-        <w:rPr>
-          <w:b/>
-          <w:bCs/>
-        </w:rPr>
-      </w:pPr>
-      <w:r>
-        <w:rPr>
-          <w:b/>
-          <w:bCs/>
-        </w:rPr>
-        <w:t>Major Final Improvements</w:t>
+        <w:t>Major Improvements</w:t>
       </w:r>
     </w:p>
     <w:tbl>
@@ -539,7 +800,23 @@
                 <w:b/>
                 <w:bCs/>
               </w:rPr>
-              <w:t>Strict Ray/FastAPI separation</w:t>
+              <w:t>Strict Ray/</w:t>
+            </w:r>
+            <w:proofErr w:type="spellStart"/>
+            <w:r>
+              <w:rPr>
+                <w:b/>
+                <w:bCs/>
+              </w:rPr>
+              <w:t>FastAPI</w:t>
+            </w:r>
+            <w:proofErr w:type="spellEnd"/>
+            <w:r>
+              <w:rPr>
+                <w:b/>
+                <w:bCs/>
+              </w:rPr>
+              <w:t xml:space="preserve"> separation</w:t>
             </w:r>
           </w:p>
         </w:tc>
@@ -632,12 +909,21 @@
                 <w:bCs/>
               </w:rPr>
             </w:pPr>
+            <w:proofErr w:type="spellStart"/>
             <w:r>
               <w:rPr>
                 <w:b/>
                 <w:bCs/>
               </w:rPr>
-              <w:t>KRaft Kafka mode</w:t>
+              <w:t>KRaft</w:t>
+            </w:r>
+            <w:proofErr w:type="spellEnd"/>
+            <w:r>
+              <w:rPr>
+                <w:b/>
+                <w:bCs/>
+              </w:rPr>
+              <w:t xml:space="preserve"> Kafka mode</w:t>
             </w:r>
           </w:p>
         </w:tc>
@@ -735,8 +1021,17 @@
                 <w:b/>
                 <w:bCs/>
               </w:rPr>
-              <w:t>SSE/WebSockets</w:t>
+              <w:t>SSE/</w:t>
             </w:r>
+            <w:proofErr w:type="spellStart"/>
+            <w:r>
+              <w:rPr>
+                <w:b/>
+                <w:bCs/>
+              </w:rPr>
+              <w:t>WebSockets</w:t>
+            </w:r>
+            <w:proofErr w:type="spellEnd"/>
           </w:p>
         </w:tc>
         <w:tc>
@@ -776,7 +1071,7 @@
           <w:bCs/>
         </w:rPr>
         <w:pict w14:anchorId="1A369AC8">
-          <v:rect id="_x0000_i1266" style="width:0;height:1.5pt" o:hralign="center" o:hrstd="t" o:hr="t" fillcolor="#a0a0a0" stroked="f"/>
+          <v:rect id="_x0000_i1026" style="width:0;height:1.5pt" o:hralign="center" o:hrstd="t" o:hr="t" fillcolor="#a0a0a0" stroked="f"/>
         </w:pict>
       </w:r>
     </w:p>
@@ -792,7 +1087,7 @@
           <w:b/>
           <w:bCs/>
         </w:rPr>
-        <w:t>FINAL SYSTEM ARCHITECTURE</w:t>
+        <w:t>SYSTEM ARCHITECTURE</w:t>
       </w:r>
     </w:p>
     <w:p>
@@ -838,7 +1133,23 @@
           <w:b/>
           <w:bCs/>
         </w:rPr>
-        <w:t xml:space="preserve">                           │  Simulated Edge AI   │</w:t>
+        <w:t xml:space="preserve">                           </w:t>
+      </w:r>
+      <w:proofErr w:type="gramStart"/>
+      <w:r>
+        <w:rPr>
+          <w:b/>
+          <w:bCs/>
+        </w:rPr>
+        <w:t>│  Simulated</w:t>
+      </w:r>
+      <w:proofErr w:type="gramEnd"/>
+      <w:r>
+        <w:rPr>
+          <w:b/>
+          <w:bCs/>
+        </w:rPr>
+        <w:t xml:space="preserve"> Edge AI   │</w:t>
       </w:r>
     </w:p>
     <w:p>
@@ -1156,7 +1467,23 @@
           <w:b/>
           <w:bCs/>
         </w:rPr>
-        <w:t xml:space="preserve">                 │ ev-telemetry                    │</w:t>
+        <w:t xml:space="preserve">                 │ </w:t>
+      </w:r>
+      <w:proofErr w:type="spellStart"/>
+      <w:r>
+        <w:rPr>
+          <w:b/>
+          <w:bCs/>
+        </w:rPr>
+        <w:t>ev</w:t>
+      </w:r>
+      <w:proofErr w:type="spellEnd"/>
+      <w:r>
+        <w:rPr>
+          <w:b/>
+          <w:bCs/>
+        </w:rPr>
+        <w:t>-telemetry                    │</w:t>
       </w:r>
     </w:p>
     <w:p>
@@ -1520,7 +1847,23 @@
           <w:b/>
           <w:bCs/>
         </w:rPr>
-        <w:t xml:space="preserve">                 │     FastAPI Microservices       │</w:t>
+        <w:t xml:space="preserve">                 │     </w:t>
+      </w:r>
+      <w:proofErr w:type="spellStart"/>
+      <w:r>
+        <w:rPr>
+          <w:b/>
+          <w:bCs/>
+        </w:rPr>
+        <w:t>FastAPI</w:t>
+      </w:r>
+      <w:proofErr w:type="spellEnd"/>
+      <w:r>
+        <w:rPr>
+          <w:b/>
+          <w:bCs/>
+        </w:rPr>
+        <w:t xml:space="preserve"> Microservices       │</w:t>
       </w:r>
     </w:p>
     <w:p>
@@ -1785,7 +2128,23 @@
           <w:b/>
           <w:bCs/>
         </w:rPr>
-        <w:t xml:space="preserve">    │ Redis State Layer  │         │ PostgreSQL Storage │</w:t>
+        <w:t xml:space="preserve">    │ Redis State </w:t>
+      </w:r>
+      <w:proofErr w:type="gramStart"/>
+      <w:r>
+        <w:rPr>
+          <w:b/>
+          <w:bCs/>
+        </w:rPr>
+        <w:t>Layer  │</w:t>
+      </w:r>
+      <w:proofErr w:type="gramEnd"/>
+      <w:r>
+        <w:rPr>
+          <w:b/>
+          <w:bCs/>
+        </w:rPr>
+        <w:t xml:space="preserve">         │ PostgreSQL Storage │</w:t>
       </w:r>
     </w:p>
     <w:p>
@@ -2556,7 +2915,7 @@
           <w:bCs/>
         </w:rPr>
         <w:pict w14:anchorId="3BDCB1D7">
-          <v:rect id="_x0000_i1267" style="width:0;height:1.5pt" o:hralign="center" o:hrstd="t" o:hr="t" fillcolor="#a0a0a0" stroked="f"/>
+          <v:rect id="_x0000_i1027" style="width:0;height:1.5pt" o:hralign="center" o:hrstd="t" o:hr="t" fillcolor="#a0a0a0" stroked="f"/>
         </w:pict>
       </w:r>
     </w:p>
@@ -2572,7 +2931,7 @@
           <w:b/>
           <w:bCs/>
         </w:rPr>
-        <w:t>FINAL TECHNOLOGY STACK</w:t>
+        <w:t>TECHNOLOGY STACK</w:t>
       </w:r>
     </w:p>
     <w:tbl>
@@ -2729,12 +3088,21 @@
                 <w:bCs/>
               </w:rPr>
             </w:pPr>
+            <w:proofErr w:type="spellStart"/>
             <w:r>
               <w:rPr>
                 <w:b/>
                 <w:bCs/>
               </w:rPr>
-              <w:t>PyTorch + YOLOv8</w:t>
+              <w:t>PyTorch</w:t>
+            </w:r>
+            <w:proofErr w:type="spellEnd"/>
+            <w:r>
+              <w:rPr>
+                <w:b/>
+                <w:bCs/>
+              </w:rPr>
+              <w:t xml:space="preserve"> + YOLOv8</w:t>
             </w:r>
           </w:p>
         </w:tc>
@@ -2876,6 +3244,7 @@
                 <w:bCs/>
               </w:rPr>
             </w:pPr>
+            <w:proofErr w:type="spellStart"/>
             <w:r>
               <w:rPr>
                 <w:b/>
@@ -2883,6 +3252,7 @@
               </w:rPr>
               <w:t>aiokafka</w:t>
             </w:r>
+            <w:proofErr w:type="spellEnd"/>
           </w:p>
         </w:tc>
       </w:tr>
@@ -2974,6 +3344,7 @@
                 <w:bCs/>
               </w:rPr>
             </w:pPr>
+            <w:proofErr w:type="spellStart"/>
             <w:r>
               <w:rPr>
                 <w:b/>
@@ -2981,6 +3352,7 @@
               </w:rPr>
               <w:t>FastAPI</w:t>
             </w:r>
+            <w:proofErr w:type="spellEnd"/>
           </w:p>
         </w:tc>
       </w:tr>
@@ -3685,7 +4057,7 @@
           <w:bCs/>
         </w:rPr>
         <w:pict w14:anchorId="1C9F4E03">
-          <v:rect id="_x0000_i1268" style="width:0;height:1.5pt" o:hralign="center" o:hrstd="t" o:hr="t" fillcolor="#a0a0a0" stroked="f"/>
+          <v:rect id="_x0000_i1028" style="width:0;height:1.5pt" o:hralign="center" o:hrstd="t" o:hr="t" fillcolor="#a0a0a0" stroked="f"/>
         </w:pict>
       </w:r>
     </w:p>
@@ -3888,7 +4260,7 @@
           <w:bCs/>
         </w:rPr>
         <w:pict w14:anchorId="268098D1">
-          <v:rect id="_x0000_i1269" style="width:0;height:1.5pt" o:hralign="center" o:hrstd="t" o:hr="t" fillcolor="#a0a0a0" stroked="f"/>
+          <v:rect id="_x0000_i1029" style="width:0;height:1.5pt" o:hralign="center" o:hrstd="t" o:hr="t" fillcolor="#a0a0a0" stroked="f"/>
         </w:pict>
       </w:r>
     </w:p>
@@ -4022,7 +4394,7 @@
           <w:bCs/>
         </w:rPr>
         <w:pict w14:anchorId="2E734798">
-          <v:rect id="_x0000_i1270" style="width:0;height:1.5pt" o:hralign="center" o:hrstd="t" o:hr="t" fillcolor="#a0a0a0" stroked="f"/>
+          <v:rect id="_x0000_i1030" style="width:0;height:1.5pt" o:hralign="center" o:hrstd="t" o:hr="t" fillcolor="#a0a0a0" stroked="f"/>
         </w:pict>
       </w:r>
     </w:p>
@@ -4137,7 +4509,7 @@
           <w:bCs/>
         </w:rPr>
         <w:pict w14:anchorId="178E5881">
-          <v:rect id="_x0000_i1271" style="width:0;height:1.5pt" o:hralign="center" o:hrstd="t" o:hr="t" fillcolor="#a0a0a0" stroked="f"/>
+          <v:rect id="_x0000_i1031" style="width:0;height:1.5pt" o:hralign="center" o:hrstd="t" o:hr="t" fillcolor="#a0a0a0" stroked="f"/>
         </w:pict>
       </w:r>
     </w:p>
@@ -4260,7 +4632,7 @@
           <w:bCs/>
         </w:rPr>
         <w:pict w14:anchorId="4AE60EE0">
-          <v:rect id="_x0000_i1272" style="width:0;height:1.5pt" o:hralign="center" o:hrstd="t" o:hr="t" fillcolor="#a0a0a0" stroked="f"/>
+          <v:rect id="_x0000_i1032" style="width:0;height:1.5pt" o:hralign="center" o:hrstd="t" o:hr="t" fillcolor="#a0a0a0" stroked="f"/>
         </w:pict>
       </w:r>
     </w:p>
@@ -4362,6 +4734,7 @@
                 <w:bCs/>
               </w:rPr>
             </w:pPr>
+            <w:proofErr w:type="spellStart"/>
             <w:r>
               <w:rPr>
                 <w:b/>
@@ -4369,6 +4742,7 @@
               </w:rPr>
               <w:t>FastAPI</w:t>
             </w:r>
+            <w:proofErr w:type="spellEnd"/>
           </w:p>
         </w:tc>
         <w:tc>
@@ -4571,7 +4945,7 @@
           <w:bCs/>
         </w:rPr>
         <w:pict w14:anchorId="76D5822F">
-          <v:rect id="_x0000_i1273" style="width:0;height:1.5pt" o:hralign="center" o:hrstd="t" o:hr="t" fillcolor="#a0a0a0" stroked="f"/>
+          <v:rect id="_x0000_i1033" style="width:0;height:1.5pt" o:hralign="center" o:hrstd="t" o:hr="t" fillcolor="#a0a0a0" stroked="f"/>
         </w:pict>
       </w:r>
     </w:p>
@@ -4633,7 +5007,7 @@
           <w:bCs/>
         </w:rPr>
         <w:pict w14:anchorId="77F04AF8">
-          <v:rect id="_x0000_i1274" style="width:0;height:1.5pt" o:hralign="center" o:hrstd="t" o:hr="t" fillcolor="#a0a0a0" stroked="f"/>
+          <v:rect id="_x0000_i1034" style="width:0;height:1.5pt" o:hralign="center" o:hrstd="t" o:hr="t" fillcolor="#a0a0a0" stroked="f"/>
         </w:pict>
       </w:r>
     </w:p>
@@ -4767,7 +5141,7 @@
           <w:bCs/>
         </w:rPr>
         <w:pict w14:anchorId="5878FCB6">
-          <v:rect id="_x0000_i1275" style="width:0;height:1.5pt" o:hralign="center" o:hrstd="t" o:hr="t" fillcolor="#a0a0a0" stroked="f"/>
+          <v:rect id="_x0000_i1035" style="width:0;height:1.5pt" o:hralign="center" o:hrstd="t" o:hr="t" fillcolor="#a0a0a0" stroked="f"/>
         </w:pict>
       </w:r>
     </w:p>
@@ -4959,7 +5333,7 @@
           <w:bCs/>
         </w:rPr>
         <w:pict w14:anchorId="3483AC42">
-          <v:rect id="_x0000_i1276" style="width:0;height:1.5pt" o:hralign="center" o:hrstd="t" o:hr="t" fillcolor="#a0a0a0" stroked="f"/>
+          <v:rect id="_x0000_i1036" style="width:0;height:1.5pt" o:hralign="center" o:hrstd="t" o:hr="t" fillcolor="#a0a0a0" stroked="f"/>
         </w:pict>
       </w:r>
     </w:p>
@@ -5116,7 +5490,7 @@
           <w:bCs/>
         </w:rPr>
         <w:pict w14:anchorId="3A742729">
-          <v:rect id="_x0000_i1277" style="width:0;height:1.5pt" o:hralign="center" o:hrstd="t" o:hr="t" fillcolor="#a0a0a0" stroked="f"/>
+          <v:rect id="_x0000_i1037" style="width:0;height:1.5pt" o:hralign="center" o:hrstd="t" o:hr="t" fillcolor="#a0a0a0" stroked="f"/>
         </w:pict>
       </w:r>
     </w:p>
@@ -5235,7 +5609,7 @@
           <w:bCs/>
         </w:rPr>
         <w:pict w14:anchorId="150F18CD">
-          <v:rect id="_x0000_i1278" style="width:0;height:1.5pt" o:hralign="center" o:hrstd="t" o:hr="t" fillcolor="#a0a0a0" stroked="f"/>
+          <v:rect id="_x0000_i1038" style="width:0;height:1.5pt" o:hralign="center" o:hrstd="t" o:hr="t" fillcolor="#a0a0a0" stroked="f"/>
         </w:pict>
       </w:r>
     </w:p>
@@ -5354,7 +5728,7 @@
           <w:bCs/>
         </w:rPr>
         <w:pict w14:anchorId="7F374031">
-          <v:rect id="_x0000_i1279" style="width:0;height:1.5pt" o:hralign="center" o:hrstd="t" o:hr="t" fillcolor="#a0a0a0" stroked="f"/>
+          <v:rect id="_x0000_i1039" style="width:0;height:1.5pt" o:hralign="center" o:hrstd="t" o:hr="t" fillcolor="#a0a0a0" stroked="f"/>
         </w:pict>
       </w:r>
     </w:p>
@@ -5475,8 +5849,17 @@
           <w:b/>
           <w:bCs/>
         </w:rPr>
-        <w:t xml:space="preserve"> FastAPI</w:t>
-      </w:r>
+        <w:t xml:space="preserve"> </w:t>
+      </w:r>
+      <w:proofErr w:type="spellStart"/>
+      <w:r>
+        <w:rPr>
+          <w:b/>
+          <w:bCs/>
+        </w:rPr>
+        <w:t>FastAPI</w:t>
+      </w:r>
+      <w:proofErr w:type="spellEnd"/>
       <w:r>
         <w:rPr>
           <w:b/>
@@ -5513,7 +5896,7 @@
           <w:bCs/>
         </w:rPr>
         <w:pict w14:anchorId="05A6A232">
-          <v:rect id="_x0000_i1280" style="width:0;height:1.5pt" o:hralign="center" o:hrstd="t" o:hr="t" fillcolor="#a0a0a0" stroked="f"/>
+          <v:rect id="_x0000_i1040" style="width:0;height:1.5pt" o:hralign="center" o:hrstd="t" o:hr="t" fillcolor="#a0a0a0" stroked="f"/>
         </w:pict>
       </w:r>
     </w:p>
@@ -5612,7 +5995,7 @@
           <w:bCs/>
         </w:rPr>
         <w:pict w14:anchorId="64A91E85">
-          <v:rect id="_x0000_i1281" style="width:0;height:1.5pt" o:hralign="center" o:hrstd="t" o:hr="t" fillcolor="#a0a0a0" stroked="f"/>
+          <v:rect id="_x0000_i1041" style="width:0;height:1.5pt" o:hralign="center" o:hrstd="t" o:hr="t" fillcolor="#a0a0a0" stroked="f"/>
         </w:pict>
       </w:r>
     </w:p>
@@ -5711,7 +6094,7 @@
           <w:bCs/>
         </w:rPr>
         <w:pict w14:anchorId="4704C3A9">
-          <v:rect id="_x0000_i1282" style="width:0;height:1.5pt" o:hralign="center" o:hrstd="t" o:hr="t" fillcolor="#a0a0a0" stroked="f"/>
+          <v:rect id="_x0000_i1042" style="width:0;height:1.5pt" o:hralign="center" o:hrstd="t" o:hr="t" fillcolor="#a0a0a0" stroked="f"/>
         </w:pict>
       </w:r>
     </w:p>
@@ -5772,8 +6155,17 @@
           <w:b/>
           <w:bCs/>
         </w:rPr>
-        <w:t xml:space="preserve"> WebSockets</w:t>
-      </w:r>
+        <w:t xml:space="preserve"> </w:t>
+      </w:r>
+      <w:proofErr w:type="spellStart"/>
+      <w:r>
+        <w:rPr>
+          <w:b/>
+          <w:bCs/>
+        </w:rPr>
+        <w:t>WebSockets</w:t>
+      </w:r>
+      <w:proofErr w:type="spellEnd"/>
       <w:r>
         <w:rPr>
           <w:b/>
@@ -5810,7 +6202,7 @@
           <w:bCs/>
         </w:rPr>
         <w:pict w14:anchorId="1CD30117">
-          <v:rect id="_x0000_i1283" style="width:0;height:1.5pt" o:hralign="center" o:hrstd="t" o:hr="t" fillcolor="#a0a0a0" stroked="f"/>
+          <v:rect id="_x0000_i1043" style="width:0;height:1.5pt" o:hralign="center" o:hrstd="t" o:hr="t" fillcolor="#a0a0a0" stroked="f"/>
         </w:pict>
       </w:r>
     </w:p>
@@ -5909,7 +6301,7 @@
           <w:bCs/>
         </w:rPr>
         <w:pict w14:anchorId="65DD88E6">
-          <v:rect id="_x0000_i1284" style="width:0;height:1.5pt" o:hralign="center" o:hrstd="t" o:hr="t" fillcolor="#a0a0a0" stroked="f"/>
+          <v:rect id="_x0000_i1044" style="width:0;height:1.5pt" o:hralign="center" o:hrstd="t" o:hr="t" fillcolor="#a0a0a0" stroked="f"/>
         </w:pict>
       </w:r>
     </w:p>
@@ -6008,7 +6400,7 @@
           <w:bCs/>
         </w:rPr>
         <w:pict w14:anchorId="7ED9CC92">
-          <v:rect id="_x0000_i1285" style="width:0;height:1.5pt" o:hralign="center" o:hrstd="t" o:hr="t" fillcolor="#a0a0a0" stroked="f"/>
+          <v:rect id="_x0000_i1045" style="width:0;height:1.5pt" o:hralign="center" o:hrstd="t" o:hr="t" fillcolor="#a0a0a0" stroked="f"/>
         </w:pict>
       </w:r>
     </w:p>
@@ -6086,7 +6478,7 @@
           <w:bCs/>
         </w:rPr>
         <w:pict w14:anchorId="048A0843">
-          <v:rect id="_x0000_i1286" style="width:0;height:1.5pt" o:hralign="center" o:hrstd="t" o:hr="t" fillcolor="#a0a0a0" stroked="f"/>
+          <v:rect id="_x0000_i1046" style="width:0;height:1.5pt" o:hralign="center" o:hrstd="t" o:hr="t" fillcolor="#a0a0a0" stroked="f"/>
         </w:pict>
       </w:r>
     </w:p>
@@ -6163,7 +6555,7 @@
           <w:bCs/>
         </w:rPr>
         <w:pict w14:anchorId="3E6B9256">
-          <v:rect id="_x0000_i1287" style="width:0;height:1.5pt" o:hralign="center" o:hrstd="t" o:hr="t" fillcolor="#a0a0a0" stroked="f"/>
+          <v:rect id="_x0000_i1047" style="width:0;height:1.5pt" o:hralign="center" o:hrstd="t" o:hr="t" fillcolor="#a0a0a0" stroked="f"/>
         </w:pict>
       </w:r>
     </w:p>
@@ -6180,36 +6572,6 @@
           <w:bCs/>
         </w:rPr>
         <w:t>Final Verdict</w:t>
-      </w:r>
-    </w:p>
-    <w:p>
-      <w:pPr>
-        <w:rPr>
-          <w:b/>
-          <w:bCs/>
-        </w:rPr>
-      </w:pPr>
-      <w:r>
-        <w:rPr>
-          <w:b/>
-          <w:bCs/>
-        </w:rPr>
-        <w:t>At this point:</w:t>
-      </w:r>
-    </w:p>
-    <w:p>
-      <w:pPr>
-        <w:rPr>
-          <w:b/>
-          <w:bCs/>
-        </w:rPr>
-      </w:pPr>
-      <w:r>
-        <w:rPr>
-          <w:b/>
-          <w:bCs/>
-        </w:rPr>
-        <w:t>this is no longer a “student project.”</w:t>
       </w:r>
     </w:p>
     <w:p>
@@ -6414,6 +6776,1769 @@
       </w:r>
     </w:p>
     <w:p/>
+    <w:p/>
+    <w:p/>
+    <w:p>
+      <w:pPr>
+        <w:rPr>
+          <w:b/>
+          <w:bCs/>
+        </w:rPr>
+      </w:pPr>
+      <w:proofErr w:type="spellStart"/>
+      <w:r>
+        <w:rPr>
+          <w:b/>
+          <w:bCs/>
+        </w:rPr>
+        <w:t>EdgeCloudX</w:t>
+      </w:r>
+      <w:proofErr w:type="spellEnd"/>
+      <w:r>
+        <w:rPr>
+          <w:b/>
+          <w:bCs/>
+        </w:rPr>
+        <w:t xml:space="preserve"> — Build Walkthrough</w:t>
+      </w:r>
+    </w:p>
+    <w:p>
+      <w:pPr>
+        <w:rPr>
+          <w:b/>
+          <w:bCs/>
+        </w:rPr>
+      </w:pPr>
+      <w:r>
+        <w:rPr>
+          <w:b/>
+          <w:bCs/>
+        </w:rPr>
+        <w:t>Summary</w:t>
+      </w:r>
+    </w:p>
+    <w:p>
+      <w:r>
+        <w:t>Built the complete foundation for </w:t>
+      </w:r>
+      <w:proofErr w:type="spellStart"/>
+      <w:r>
+        <w:rPr>
+          <w:b/>
+          <w:bCs/>
+        </w:rPr>
+        <w:t>EdgeCloudX</w:t>
+      </w:r>
+      <w:proofErr w:type="spellEnd"/>
+      <w:r>
+        <w:rPr>
+          <w:b/>
+          <w:bCs/>
+        </w:rPr>
+        <w:t xml:space="preserve"> — Autonomous Smart City Traffic &amp; Navigation Grid</w:t>
+      </w:r>
+      <w:r>
+        <w:t> from scratch. Created </w:t>
+      </w:r>
+      <w:r>
+        <w:rPr>
+          <w:b/>
+          <w:bCs/>
+        </w:rPr>
+        <w:t>63 files</w:t>
+      </w:r>
+      <w:r>
+        <w:t> covering 6 microservices, edge AI simulation, monitoring configs, Docker orchestration, and tests.</w:t>
+      </w:r>
+    </w:p>
+    <w:p>
+      <w:r>
+        <w:pict w14:anchorId="6BBC15C1">
+          <v:rect id="_x0000_i1048" style="width:525.45pt;height:.75pt" o:hrpct="0" o:hralign="center" o:hrstd="t" o:hr="t" fillcolor="#a0a0a0" stroked="f"/>
+        </w:pict>
+      </w:r>
+    </w:p>
+    <w:p>
+      <w:pPr>
+        <w:rPr>
+          <w:b/>
+          <w:bCs/>
+        </w:rPr>
+      </w:pPr>
+      <w:r>
+        <w:rPr>
+          <w:b/>
+          <w:bCs/>
+        </w:rPr>
+        <w:lastRenderedPageBreak/>
+        <w:t>What Was Built</w:t>
+      </w:r>
+    </w:p>
+    <w:p>
+      <w:r>
+        <w:t xml:space="preserve">Phase 1 — Core Infrastructure </w:t>
+      </w:r>
+      <w:r>
+        <w:rPr>
+          <w:rFonts w:ascii="Segoe UI Emoji" w:hAnsi="Segoe UI Emoji" w:cs="Segoe UI Emoji"/>
+        </w:rPr>
+        <w:t>✅</w:t>
+      </w:r>
+    </w:p>
+    <w:p>
+      <w:r>
+        <w:t>Docker Compose (docker-</w:t>
+      </w:r>
+      <w:proofErr w:type="spellStart"/>
+      <w:r>
+        <w:t>compose.yml</w:t>
+      </w:r>
+      <w:proofErr w:type="spellEnd"/>
+      <w:r>
+        <w:t>)</w:t>
+      </w:r>
+    </w:p>
+    <w:p>
+      <w:pPr>
+        <w:numPr>
+          <w:ilvl w:val="0"/>
+          <w:numId w:val="33"/>
+        </w:numPr>
+      </w:pPr>
+      <w:r>
+        <w:rPr>
+          <w:b/>
+          <w:bCs/>
+        </w:rPr>
+        <w:t>Kafka</w:t>
+      </w:r>
+      <w:r>
+        <w:t> (</w:t>
+      </w:r>
+      <w:proofErr w:type="spellStart"/>
+      <w:r>
+        <w:t>KRaft</w:t>
+      </w:r>
+      <w:proofErr w:type="spellEnd"/>
+      <w:r>
+        <w:t xml:space="preserve"> mode, no </w:t>
+      </w:r>
+      <w:proofErr w:type="spellStart"/>
+      <w:r>
+        <w:t>ZooKeeper</w:t>
+      </w:r>
+      <w:proofErr w:type="spellEnd"/>
+      <w:r>
+        <w:t>) with health checks and 5 pre-created topics</w:t>
+      </w:r>
+    </w:p>
+    <w:p>
+      <w:pPr>
+        <w:numPr>
+          <w:ilvl w:val="0"/>
+          <w:numId w:val="33"/>
+        </w:numPr>
+      </w:pPr>
+      <w:r>
+        <w:rPr>
+          <w:b/>
+          <w:bCs/>
+        </w:rPr>
+        <w:t>Redis</w:t>
+      </w:r>
+      <w:r>
+        <w:t> 7 Alpine with AOF persistence and memory limits</w:t>
+      </w:r>
+    </w:p>
+    <w:p>
+      <w:pPr>
+        <w:numPr>
+          <w:ilvl w:val="0"/>
+          <w:numId w:val="33"/>
+        </w:numPr>
+      </w:pPr>
+      <w:r>
+        <w:rPr>
+          <w:b/>
+          <w:bCs/>
+        </w:rPr>
+        <w:t>PostgreSQL</w:t>
+      </w:r>
+      <w:r>
+        <w:t> 16 Alpine with health checks and volume persistence</w:t>
+      </w:r>
+    </w:p>
+    <w:p>
+      <w:pPr>
+        <w:numPr>
+          <w:ilvl w:val="0"/>
+          <w:numId w:val="33"/>
+        </w:numPr>
+      </w:pPr>
+      <w:r>
+        <w:t>Topic initializer container that creates all required Kafka topics on startup</w:t>
+      </w:r>
+    </w:p>
+    <w:p>
+      <w:pPr>
+        <w:numPr>
+          <w:ilvl w:val="0"/>
+          <w:numId w:val="33"/>
+        </w:numPr>
+      </w:pPr>
+      <w:r>
+        <w:t>Shared </w:t>
+      </w:r>
+      <w:proofErr w:type="spellStart"/>
+      <w:r>
+        <w:t>edgecloudx</w:t>
+      </w:r>
+      <w:proofErr w:type="spellEnd"/>
+      <w:r>
+        <w:t>-net bridge network</w:t>
+      </w:r>
+    </w:p>
+    <w:p>
+      <w:r>
+        <w:t>Traffic Service (services/traffic-service/)</w:t>
+      </w:r>
+    </w:p>
+    <w:p>
+      <w:r>
+        <w:t>The most complex microservice — handles traffic data ingestion and grid management:</w:t>
+      </w:r>
+    </w:p>
+    <w:p>
+      <w:pPr>
+        <w:numPr>
+          <w:ilvl w:val="0"/>
+          <w:numId w:val="34"/>
+        </w:numPr>
+      </w:pPr>
+      <w:proofErr w:type="spellStart"/>
+      <w:r>
+        <w:t>SQLAlchemy</w:t>
+      </w:r>
+      <w:proofErr w:type="spellEnd"/>
+      <w:r>
+        <w:t xml:space="preserve"> models — Intersection and </w:t>
+      </w:r>
+      <w:proofErr w:type="spellStart"/>
+      <w:r>
+        <w:t>TrafficEvent</w:t>
+      </w:r>
+      <w:proofErr w:type="spellEnd"/>
+      <w:r>
+        <w:t> tables</w:t>
+      </w:r>
+    </w:p>
+    <w:p>
+      <w:pPr>
+        <w:numPr>
+          <w:ilvl w:val="0"/>
+          <w:numId w:val="34"/>
+        </w:numPr>
+      </w:pPr>
+      <w:proofErr w:type="spellStart"/>
+      <w:r>
+        <w:t>Pydantic</w:t>
+      </w:r>
+      <w:proofErr w:type="spellEnd"/>
+      <w:r>
+        <w:t xml:space="preserve"> schemas — Request/response validation</w:t>
+      </w:r>
+    </w:p>
+    <w:p>
+      <w:pPr>
+        <w:numPr>
+          <w:ilvl w:val="0"/>
+          <w:numId w:val="34"/>
+        </w:numPr>
+      </w:pPr>
+      <w:r>
+        <w:t>Traffic router — /traffic/grid, /traffic/intersection/{id}, /traffic/update, /traffic/events, /traffic/stats</w:t>
+      </w:r>
+    </w:p>
+    <w:p>
+      <w:pPr>
+        <w:numPr>
+          <w:ilvl w:val="0"/>
+          <w:numId w:val="34"/>
+        </w:numPr>
+      </w:pPr>
+      <w:r>
+        <w:t>Health router — Checks Kafka, Redis, PostgreSQL connectivity</w:t>
+      </w:r>
+    </w:p>
+    <w:p>
+      <w:pPr>
+        <w:numPr>
+          <w:ilvl w:val="0"/>
+          <w:numId w:val="34"/>
+        </w:numPr>
+      </w:pPr>
+      <w:r>
+        <w:t>Business logic — Congestion calculation, auto-</w:t>
+      </w:r>
+      <w:proofErr w:type="spellStart"/>
+      <w:r>
+        <w:t>signaling</w:t>
+      </w:r>
+      <w:proofErr w:type="spellEnd"/>
+      <w:r>
+        <w:t>, grid seeding, Redis pub/sub</w:t>
+      </w:r>
+    </w:p>
+    <w:p>
+      <w:pPr>
+        <w:numPr>
+          <w:ilvl w:val="0"/>
+          <w:numId w:val="34"/>
+        </w:numPr>
+      </w:pPr>
+      <w:r>
+        <w:t>Kafka consumer — Async consumer with retry backoff on traffic-density topic</w:t>
+      </w:r>
+    </w:p>
+    <w:p>
+      <w:r>
+        <w:t>Routing Service (services/routing-service/)</w:t>
+      </w:r>
+    </w:p>
+    <w:p>
+      <w:pPr>
+        <w:numPr>
+          <w:ilvl w:val="0"/>
+          <w:numId w:val="35"/>
+        </w:numPr>
+      </w:pPr>
+      <w:r>
+        <w:t>A* Pathfinder — Congestion-weighted routing using real-time Redis data</w:t>
+      </w:r>
+    </w:p>
+    <w:p>
+      <w:pPr>
+        <w:numPr>
+          <w:ilvl w:val="0"/>
+          <w:numId w:val="35"/>
+        </w:numPr>
+      </w:pPr>
+      <w:r>
+        <w:t>Emergency green corridor calculation</w:t>
+      </w:r>
+    </w:p>
+    <w:p>
+      <w:pPr>
+        <w:numPr>
+          <w:ilvl w:val="0"/>
+          <w:numId w:val="35"/>
+        </w:numPr>
+      </w:pPr>
+      <w:r>
+        <w:t>Manhattan distance heuristic on city grid</w:t>
+      </w:r>
+    </w:p>
+    <w:p>
+      <w:r>
+        <w:t>Analytics Service (services/analytics-service/)</w:t>
+      </w:r>
+    </w:p>
+    <w:p>
+      <w:pPr>
+        <w:numPr>
+          <w:ilvl w:val="0"/>
+          <w:numId w:val="36"/>
+        </w:numPr>
+      </w:pPr>
+      <w:r>
+        <w:t>Real-time congestion reports with hotspot detection</w:t>
+      </w:r>
+    </w:p>
+    <w:p>
+      <w:pPr>
+        <w:numPr>
+          <w:ilvl w:val="0"/>
+          <w:numId w:val="36"/>
+        </w:numPr>
+      </w:pPr>
+      <w:r>
+        <w:t>2D heatmap matrix endpoint for visualization</w:t>
+      </w:r>
+    </w:p>
+    <w:p>
+      <w:pPr>
+        <w:numPr>
+          <w:ilvl w:val="0"/>
+          <w:numId w:val="36"/>
+        </w:numPr>
+      </w:pPr>
+      <w:r>
+        <w:t>Historical analytics placeholder</w:t>
+      </w:r>
+    </w:p>
+    <w:p>
+      <w:r>
+        <w:t>Alert Service (services/alert-service/)</w:t>
+      </w:r>
+    </w:p>
+    <w:p>
+      <w:pPr>
+        <w:numPr>
+          <w:ilvl w:val="0"/>
+          <w:numId w:val="37"/>
+        </w:numPr>
+      </w:pPr>
+      <w:r>
+        <w:t>Kafka consumer on emergency-alerts topic</w:t>
+      </w:r>
+    </w:p>
+    <w:p>
+      <w:pPr>
+        <w:numPr>
+          <w:ilvl w:val="0"/>
+          <w:numId w:val="37"/>
+        </w:numPr>
+      </w:pPr>
+      <w:r>
+        <w:lastRenderedPageBreak/>
+        <w:t>Manual alert creation and resolution endpoints</w:t>
+      </w:r>
+    </w:p>
+    <w:p>
+      <w:pPr>
+        <w:numPr>
+          <w:ilvl w:val="0"/>
+          <w:numId w:val="37"/>
+        </w:numPr>
+      </w:pPr>
+      <w:r>
+        <w:t>Redis pub/sub for dashboard notifications</w:t>
+      </w:r>
+    </w:p>
+    <w:p>
+      <w:pPr>
+        <w:numPr>
+          <w:ilvl w:val="0"/>
+          <w:numId w:val="37"/>
+        </w:numPr>
+      </w:pPr>
+      <w:r>
+        <w:t>Intersection emergency flag management</w:t>
+      </w:r>
+    </w:p>
+    <w:p>
+      <w:r>
+        <w:t>Auth Service (services/auth-service/)</w:t>
+      </w:r>
+    </w:p>
+    <w:p>
+      <w:pPr>
+        <w:numPr>
+          <w:ilvl w:val="0"/>
+          <w:numId w:val="38"/>
+        </w:numPr>
+      </w:pPr>
+      <w:r>
+        <w:t>JWT token generation and verification</w:t>
+      </w:r>
+    </w:p>
+    <w:p>
+      <w:pPr>
+        <w:numPr>
+          <w:ilvl w:val="0"/>
+          <w:numId w:val="38"/>
+        </w:numPr>
+      </w:pPr>
+      <w:proofErr w:type="spellStart"/>
+      <w:r>
+        <w:t>Bcrypt</w:t>
+      </w:r>
+      <w:proofErr w:type="spellEnd"/>
+      <w:r>
+        <w:t xml:space="preserve"> password hashing</w:t>
+      </w:r>
+    </w:p>
+    <w:p>
+      <w:pPr>
+        <w:numPr>
+          <w:ilvl w:val="0"/>
+          <w:numId w:val="38"/>
+        </w:numPr>
+      </w:pPr>
+      <w:r>
+        <w:t>User registration and login</w:t>
+      </w:r>
+    </w:p>
+    <w:p>
+      <w:pPr>
+        <w:numPr>
+          <w:ilvl w:val="0"/>
+          <w:numId w:val="38"/>
+        </w:numPr>
+      </w:pPr>
+      <w:r>
+        <w:t>Protected endpoint dependency (</w:t>
+      </w:r>
+      <w:proofErr w:type="spellStart"/>
+      <w:r>
+        <w:t>get_current_user</w:t>
+      </w:r>
+      <w:proofErr w:type="spellEnd"/>
+      <w:r>
+        <w:t>)</w:t>
+      </w:r>
+    </w:p>
+    <w:p>
+      <w:r>
+        <w:pict w14:anchorId="299B7258">
+          <v:rect id="_x0000_i1049" style="width:525.45pt;height:.75pt" o:hrpct="0" o:hralign="center" o:hrstd="t" o:hr="t" fillcolor="#a0a0a0" stroked="f"/>
+        </w:pict>
+      </w:r>
+    </w:p>
+    <w:p>
+      <w:r>
+        <w:t xml:space="preserve">Phase 2 — Edge AI Nodes </w:t>
+      </w:r>
+      <w:r>
+        <w:rPr>
+          <w:rFonts w:ascii="Segoe UI Emoji" w:hAnsi="Segoe UI Emoji" w:cs="Segoe UI Emoji"/>
+        </w:rPr>
+        <w:t>✅</w:t>
+      </w:r>
+    </w:p>
+    <w:p>
+      <w:r>
+        <w:t>Edge Node (services/edge-node/)</w:t>
+      </w:r>
+    </w:p>
+    <w:p>
+      <w:pPr>
+        <w:numPr>
+          <w:ilvl w:val="0"/>
+          <w:numId w:val="39"/>
+        </w:numPr>
+      </w:pPr>
+      <w:r>
+        <w:t>Traffic Simulator — Mean-reverting vehicle counts, time-of-day variation, anomaly generation, synthetic frame rendering</w:t>
+      </w:r>
+    </w:p>
+    <w:p>
+      <w:pPr>
+        <w:numPr>
+          <w:ilvl w:val="0"/>
+          <w:numId w:val="39"/>
+        </w:numPr>
+      </w:pPr>
+      <w:r>
+        <w:t>YOLOv8 Detector — Wrapper with graceful fallback to simulation mode</w:t>
+      </w:r>
+    </w:p>
+    <w:p>
+      <w:pPr>
+        <w:numPr>
+          <w:ilvl w:val="0"/>
+          <w:numId w:val="39"/>
+        </w:numPr>
+      </w:pPr>
+      <w:r>
+        <w:t xml:space="preserve">Kafka Producer — </w:t>
+      </w:r>
+      <w:proofErr w:type="spellStart"/>
+      <w:r>
+        <w:t>Gzip</w:t>
+      </w:r>
+      <w:proofErr w:type="spellEnd"/>
+      <w:r>
+        <w:t xml:space="preserve"> compression, batching, typed send methods for all 5 topics</w:t>
+      </w:r>
+    </w:p>
+    <w:p>
+      <w:pPr>
+        <w:numPr>
+          <w:ilvl w:val="0"/>
+          <w:numId w:val="39"/>
+        </w:numPr>
+      </w:pPr>
+      <w:r>
+        <w:t>EV Fleet Simulator — Fleet movement, battery drain, charging cycles</w:t>
+      </w:r>
+    </w:p>
+    <w:p>
+      <w:pPr>
+        <w:numPr>
+          <w:ilvl w:val="0"/>
+          <w:numId w:val="39"/>
+        </w:numPr>
+      </w:pPr>
+      <w:r>
+        <w:t>Main orchestrator — Tick-based loop producing traffic, EV, emergency, and health events</w:t>
+      </w:r>
+    </w:p>
+    <w:p>
+      <w:r>
+        <w:pict w14:anchorId="4B7E5CBB">
+          <v:rect id="_x0000_i1050" style="width:525.45pt;height:.75pt" o:hrpct="0" o:hralign="center" o:hrstd="t" o:hr="t" fillcolor="#a0a0a0" stroked="f"/>
+        </w:pict>
+      </w:r>
+    </w:p>
+    <w:p>
+      <w:r>
+        <w:t xml:space="preserve">Monitoring Configs (Phase 6 — Partial) </w:t>
+      </w:r>
+      <w:r>
+        <w:rPr>
+          <w:rFonts w:ascii="Segoe UI Emoji" w:hAnsi="Segoe UI Emoji" w:cs="Segoe UI Emoji"/>
+        </w:rPr>
+        <w:t>✅</w:t>
+      </w:r>
+    </w:p>
+    <w:p>
+      <w:pPr>
+        <w:numPr>
+          <w:ilvl w:val="0"/>
+          <w:numId w:val="40"/>
+        </w:numPr>
+      </w:pPr>
+      <w:r>
+        <w:t xml:space="preserve">Prometheus — Scraping all </w:t>
+      </w:r>
+      <w:proofErr w:type="spellStart"/>
+      <w:r>
+        <w:t>FastAPI</w:t>
+      </w:r>
+      <w:proofErr w:type="spellEnd"/>
+      <w:r>
+        <w:t> /metrics endpoints</w:t>
+      </w:r>
+    </w:p>
+    <w:p>
+      <w:pPr>
+        <w:numPr>
+          <w:ilvl w:val="0"/>
+          <w:numId w:val="40"/>
+        </w:numPr>
+      </w:pPr>
+      <w:r>
+        <w:t xml:space="preserve">Grafana — </w:t>
+      </w:r>
+      <w:proofErr w:type="spellStart"/>
+      <w:r>
+        <w:t>Datasource</w:t>
+      </w:r>
+      <w:proofErr w:type="spellEnd"/>
+      <w:r>
+        <w:t xml:space="preserve"> provisioning</w:t>
+      </w:r>
+    </w:p>
+    <w:p>
+      <w:pPr>
+        <w:numPr>
+          <w:ilvl w:val="0"/>
+          <w:numId w:val="40"/>
+        </w:numPr>
+      </w:pPr>
+      <w:r>
+        <w:t>Loki — Log aggregation config</w:t>
+      </w:r>
+    </w:p>
+    <w:p>
+      <w:r>
+        <w:pict w14:anchorId="49B845B4">
+          <v:rect id="_x0000_i1051" style="width:525.45pt;height:.75pt" o:hrpct="0" o:hralign="center" o:hrstd="t" o:hr="t" fillcolor="#a0a0a0" stroked="f"/>
+        </w:pict>
+      </w:r>
+    </w:p>
+    <w:p>
+      <w:r>
+        <w:t xml:space="preserve">Tests </w:t>
+      </w:r>
+      <w:r>
+        <w:rPr>
+          <w:rFonts w:ascii="Segoe UI Emoji" w:hAnsi="Segoe UI Emoji" w:cs="Segoe UI Emoji"/>
+        </w:rPr>
+        <w:t>✅</w:t>
+      </w:r>
+    </w:p>
+    <w:p>
+      <w:pPr>
+        <w:numPr>
+          <w:ilvl w:val="0"/>
+          <w:numId w:val="41"/>
+        </w:numPr>
+      </w:pPr>
+      <w:r>
+        <w:t>Traffic Service Tests — Schema validation, congestion level boundaries</w:t>
+      </w:r>
+    </w:p>
+    <w:p>
+      <w:pPr>
+        <w:numPr>
+          <w:ilvl w:val="0"/>
+          <w:numId w:val="41"/>
+        </w:numPr>
+      </w:pPr>
+      <w:r>
+        <w:t xml:space="preserve">Routing Tests — A* pathfinding, grid </w:t>
+      </w:r>
+      <w:proofErr w:type="spellStart"/>
+      <w:r>
+        <w:t>neighbors</w:t>
+      </w:r>
+      <w:proofErr w:type="spellEnd"/>
+      <w:r>
+        <w:t>, emergency corridors</w:t>
+      </w:r>
+    </w:p>
+    <w:p>
+      <w:pPr>
+        <w:numPr>
+          <w:ilvl w:val="0"/>
+          <w:numId w:val="41"/>
+        </w:numPr>
+      </w:pPr>
+      <w:r>
+        <w:t>Detector Tests — Traffic simulator, EV fleet simulator</w:t>
+      </w:r>
+    </w:p>
+    <w:p>
+      <w:r>
+        <w:lastRenderedPageBreak/>
+        <w:pict w14:anchorId="3D56E714">
+          <v:rect id="_x0000_i1052" style="width:525.45pt;height:.75pt" o:hrpct="0" o:hralign="center" o:hrstd="t" o:hr="t" fillcolor="#a0a0a0" stroked="f"/>
+        </w:pict>
+      </w:r>
+    </w:p>
+    <w:p>
+      <w:pPr>
+        <w:rPr>
+          <w:b/>
+          <w:bCs/>
+        </w:rPr>
+      </w:pPr>
+      <w:r>
+        <w:rPr>
+          <w:b/>
+          <w:bCs/>
+        </w:rPr>
+        <w:t>Architecture Decisions</w:t>
+      </w:r>
+    </w:p>
+    <w:tbl>
+      <w:tblPr>
+        <w:tblW w:w="0" w:type="auto"/>
+        <w:tblCellSpacing w:w="15" w:type="dxa"/>
+        <w:tblBorders>
+          <w:top w:val="single" w:sz="2" w:space="0" w:color="auto"/>
+          <w:left w:val="single" w:sz="2" w:space="0" w:color="auto"/>
+          <w:bottom w:val="single" w:sz="2" w:space="0" w:color="auto"/>
+          <w:right w:val="single" w:sz="2" w:space="0" w:color="auto"/>
+        </w:tblBorders>
+        <w:tblCellMar>
+          <w:top w:w="15" w:type="dxa"/>
+          <w:left w:w="15" w:type="dxa"/>
+          <w:bottom w:w="15" w:type="dxa"/>
+          <w:right w:w="15" w:type="dxa"/>
+        </w:tblCellMar>
+        <w:tblLook w:val="04A0" w:firstRow="1" w:lastRow="0" w:firstColumn="1" w:lastColumn="0" w:noHBand="0" w:noVBand="1"/>
+      </w:tblPr>
+      <w:tblGrid>
+        <w:gridCol w:w="1641"/>
+        <w:gridCol w:w="3171"/>
+        <w:gridCol w:w="3539"/>
+      </w:tblGrid>
+      <w:tr>
+        <w:trPr>
+          <w:tblHeader/>
+          <w:tblCellSpacing w:w="15" w:type="dxa"/>
+        </w:trPr>
+        <w:tc>
+          <w:tcPr>
+            <w:tcW w:w="0" w:type="auto"/>
+            <w:tcBorders>
+              <w:top w:val="single" w:sz="2" w:space="0" w:color="auto"/>
+              <w:left w:val="single" w:sz="2" w:space="0" w:color="auto"/>
+              <w:bottom w:val="single" w:sz="6" w:space="0" w:color="auto"/>
+              <w:right w:val="single" w:sz="6" w:space="0" w:color="auto"/>
+            </w:tcBorders>
+            <w:vAlign w:val="center"/>
+            <w:hideMark/>
+          </w:tcPr>
+          <w:p>
+            <w:r>
+              <w:t>Decision</w:t>
+            </w:r>
+          </w:p>
+        </w:tc>
+        <w:tc>
+          <w:tcPr>
+            <w:tcW w:w="0" w:type="auto"/>
+            <w:tcBorders>
+              <w:top w:val="single" w:sz="2" w:space="0" w:color="auto"/>
+              <w:left w:val="single" w:sz="6" w:space="0" w:color="auto"/>
+              <w:bottom w:val="single" w:sz="6" w:space="0" w:color="auto"/>
+              <w:right w:val="single" w:sz="6" w:space="0" w:color="auto"/>
+            </w:tcBorders>
+            <w:vAlign w:val="center"/>
+            <w:hideMark/>
+          </w:tcPr>
+          <w:p>
+            <w:r>
+              <w:t>Choice</w:t>
+            </w:r>
+          </w:p>
+        </w:tc>
+        <w:tc>
+          <w:tcPr>
+            <w:tcW w:w="0" w:type="auto"/>
+            <w:tcBorders>
+              <w:top w:val="single" w:sz="2" w:space="0" w:color="auto"/>
+              <w:left w:val="single" w:sz="6" w:space="0" w:color="auto"/>
+              <w:bottom w:val="single" w:sz="6" w:space="0" w:color="auto"/>
+              <w:right w:val="single" w:sz="2" w:space="0" w:color="auto"/>
+            </w:tcBorders>
+            <w:vAlign w:val="center"/>
+            <w:hideMark/>
+          </w:tcPr>
+          <w:p>
+            <w:r>
+              <w:t>Rationale</w:t>
+            </w:r>
+          </w:p>
+        </w:tc>
+      </w:tr>
+      <w:tr>
+        <w:trPr>
+          <w:tblCellSpacing w:w="15" w:type="dxa"/>
+        </w:trPr>
+        <w:tc>
+          <w:tcPr>
+            <w:tcW w:w="0" w:type="auto"/>
+            <w:tcBorders>
+              <w:top w:val="single" w:sz="6" w:space="0" w:color="auto"/>
+              <w:left w:val="single" w:sz="2" w:space="0" w:color="auto"/>
+              <w:bottom w:val="single" w:sz="6" w:space="0" w:color="auto"/>
+              <w:right w:val="single" w:sz="6" w:space="0" w:color="auto"/>
+            </w:tcBorders>
+            <w:vAlign w:val="center"/>
+            <w:hideMark/>
+          </w:tcPr>
+          <w:p>
+            <w:r>
+              <w:t>Kafka mode</w:t>
+            </w:r>
+          </w:p>
+        </w:tc>
+        <w:tc>
+          <w:tcPr>
+            <w:tcW w:w="0" w:type="auto"/>
+            <w:tcBorders>
+              <w:top w:val="single" w:sz="6" w:space="0" w:color="auto"/>
+              <w:left w:val="single" w:sz="6" w:space="0" w:color="auto"/>
+              <w:bottom w:val="single" w:sz="6" w:space="0" w:color="auto"/>
+              <w:right w:val="single" w:sz="6" w:space="0" w:color="auto"/>
+            </w:tcBorders>
+            <w:vAlign w:val="center"/>
+            <w:hideMark/>
+          </w:tcPr>
+          <w:p>
+            <w:proofErr w:type="spellStart"/>
+            <w:r>
+              <w:t>KRaft</w:t>
+            </w:r>
+            <w:proofErr w:type="spellEnd"/>
+            <w:r>
+              <w:t xml:space="preserve"> (no </w:t>
+            </w:r>
+            <w:proofErr w:type="spellStart"/>
+            <w:r>
+              <w:t>ZooKeeper</w:t>
+            </w:r>
+            <w:proofErr w:type="spellEnd"/>
+            <w:r>
+              <w:t>)</w:t>
+            </w:r>
+          </w:p>
+        </w:tc>
+        <w:tc>
+          <w:tcPr>
+            <w:tcW w:w="0" w:type="auto"/>
+            <w:tcBorders>
+              <w:top w:val="single" w:sz="6" w:space="0" w:color="auto"/>
+              <w:left w:val="single" w:sz="6" w:space="0" w:color="auto"/>
+              <w:bottom w:val="single" w:sz="6" w:space="0" w:color="auto"/>
+              <w:right w:val="single" w:sz="2" w:space="0" w:color="auto"/>
+            </w:tcBorders>
+            <w:vAlign w:val="center"/>
+            <w:hideMark/>
+          </w:tcPr>
+          <w:p>
+            <w:r>
+              <w:t>Simpler deployment, modern Kafka</w:t>
+            </w:r>
+          </w:p>
+        </w:tc>
+      </w:tr>
+      <w:tr>
+        <w:trPr>
+          <w:tblCellSpacing w:w="15" w:type="dxa"/>
+        </w:trPr>
+        <w:tc>
+          <w:tcPr>
+            <w:tcW w:w="0" w:type="auto"/>
+            <w:tcBorders>
+              <w:top w:val="single" w:sz="6" w:space="0" w:color="auto"/>
+              <w:left w:val="single" w:sz="2" w:space="0" w:color="auto"/>
+              <w:bottom w:val="single" w:sz="6" w:space="0" w:color="auto"/>
+              <w:right w:val="single" w:sz="6" w:space="0" w:color="auto"/>
+            </w:tcBorders>
+            <w:vAlign w:val="center"/>
+            <w:hideMark/>
+          </w:tcPr>
+          <w:p>
+            <w:r>
+              <w:t>DB ORM</w:t>
+            </w:r>
+          </w:p>
+        </w:tc>
+        <w:tc>
+          <w:tcPr>
+            <w:tcW w:w="0" w:type="auto"/>
+            <w:tcBorders>
+              <w:top w:val="single" w:sz="6" w:space="0" w:color="auto"/>
+              <w:left w:val="single" w:sz="6" w:space="0" w:color="auto"/>
+              <w:bottom w:val="single" w:sz="6" w:space="0" w:color="auto"/>
+              <w:right w:val="single" w:sz="6" w:space="0" w:color="auto"/>
+            </w:tcBorders>
+            <w:vAlign w:val="center"/>
+            <w:hideMark/>
+          </w:tcPr>
+          <w:p>
+            <w:proofErr w:type="spellStart"/>
+            <w:r>
+              <w:t>SQLAlchemy</w:t>
+            </w:r>
+            <w:proofErr w:type="spellEnd"/>
+            <w:r>
+              <w:t xml:space="preserve"> async</w:t>
+            </w:r>
+          </w:p>
+        </w:tc>
+        <w:tc>
+          <w:tcPr>
+            <w:tcW w:w="0" w:type="auto"/>
+            <w:tcBorders>
+              <w:top w:val="single" w:sz="6" w:space="0" w:color="auto"/>
+              <w:left w:val="single" w:sz="6" w:space="0" w:color="auto"/>
+              <w:bottom w:val="single" w:sz="6" w:space="0" w:color="auto"/>
+              <w:right w:val="single" w:sz="2" w:space="0" w:color="auto"/>
+            </w:tcBorders>
+            <w:vAlign w:val="center"/>
+            <w:hideMark/>
+          </w:tcPr>
+          <w:p>
+            <w:r>
+              <w:t>Native async support, type hints</w:t>
+            </w:r>
+          </w:p>
+        </w:tc>
+      </w:tr>
+      <w:tr>
+        <w:trPr>
+          <w:tblCellSpacing w:w="15" w:type="dxa"/>
+        </w:trPr>
+        <w:tc>
+          <w:tcPr>
+            <w:tcW w:w="0" w:type="auto"/>
+            <w:tcBorders>
+              <w:top w:val="single" w:sz="6" w:space="0" w:color="auto"/>
+              <w:left w:val="single" w:sz="2" w:space="0" w:color="auto"/>
+              <w:bottom w:val="single" w:sz="6" w:space="0" w:color="auto"/>
+              <w:right w:val="single" w:sz="6" w:space="0" w:color="auto"/>
+            </w:tcBorders>
+            <w:vAlign w:val="center"/>
+            <w:hideMark/>
+          </w:tcPr>
+          <w:p>
+            <w:r>
+              <w:t>Auth</w:t>
+            </w:r>
+          </w:p>
+        </w:tc>
+        <w:tc>
+          <w:tcPr>
+            <w:tcW w:w="0" w:type="auto"/>
+            <w:tcBorders>
+              <w:top w:val="single" w:sz="6" w:space="0" w:color="auto"/>
+              <w:left w:val="single" w:sz="6" w:space="0" w:color="auto"/>
+              <w:bottom w:val="single" w:sz="6" w:space="0" w:color="auto"/>
+              <w:right w:val="single" w:sz="6" w:space="0" w:color="auto"/>
+            </w:tcBorders>
+            <w:vAlign w:val="center"/>
+            <w:hideMark/>
+          </w:tcPr>
+          <w:p>
+            <w:r>
+              <w:t xml:space="preserve">JWT + </w:t>
+            </w:r>
+            <w:proofErr w:type="spellStart"/>
+            <w:r>
+              <w:t>bcrypt</w:t>
+            </w:r>
+            <w:proofErr w:type="spellEnd"/>
+          </w:p>
+        </w:tc>
+        <w:tc>
+          <w:tcPr>
+            <w:tcW w:w="0" w:type="auto"/>
+            <w:tcBorders>
+              <w:top w:val="single" w:sz="6" w:space="0" w:color="auto"/>
+              <w:left w:val="single" w:sz="6" w:space="0" w:color="auto"/>
+              <w:bottom w:val="single" w:sz="6" w:space="0" w:color="auto"/>
+              <w:right w:val="single" w:sz="2" w:space="0" w:color="auto"/>
+            </w:tcBorders>
+            <w:vAlign w:val="center"/>
+            <w:hideMark/>
+          </w:tcPr>
+          <w:p>
+            <w:r>
+              <w:t>Stateless, scalable</w:t>
+            </w:r>
+          </w:p>
+        </w:tc>
+      </w:tr>
+      <w:tr>
+        <w:trPr>
+          <w:tblCellSpacing w:w="15" w:type="dxa"/>
+        </w:trPr>
+        <w:tc>
+          <w:tcPr>
+            <w:tcW w:w="0" w:type="auto"/>
+            <w:tcBorders>
+              <w:top w:val="single" w:sz="6" w:space="0" w:color="auto"/>
+              <w:left w:val="single" w:sz="2" w:space="0" w:color="auto"/>
+              <w:bottom w:val="single" w:sz="6" w:space="0" w:color="auto"/>
+              <w:right w:val="single" w:sz="6" w:space="0" w:color="auto"/>
+            </w:tcBorders>
+            <w:vAlign w:val="center"/>
+            <w:hideMark/>
+          </w:tcPr>
+          <w:p>
+            <w:r>
+              <w:t>Pathfinding</w:t>
+            </w:r>
+          </w:p>
+        </w:tc>
+        <w:tc>
+          <w:tcPr>
+            <w:tcW w:w="0" w:type="auto"/>
+            <w:tcBorders>
+              <w:top w:val="single" w:sz="6" w:space="0" w:color="auto"/>
+              <w:left w:val="single" w:sz="6" w:space="0" w:color="auto"/>
+              <w:bottom w:val="single" w:sz="6" w:space="0" w:color="auto"/>
+              <w:right w:val="single" w:sz="6" w:space="0" w:color="auto"/>
+            </w:tcBorders>
+            <w:vAlign w:val="center"/>
+            <w:hideMark/>
+          </w:tcPr>
+          <w:p>
+            <w:r>
+              <w:t>A* with congestion weights</w:t>
+            </w:r>
+          </w:p>
+        </w:tc>
+        <w:tc>
+          <w:tcPr>
+            <w:tcW w:w="0" w:type="auto"/>
+            <w:tcBorders>
+              <w:top w:val="single" w:sz="6" w:space="0" w:color="auto"/>
+              <w:left w:val="single" w:sz="6" w:space="0" w:color="auto"/>
+              <w:bottom w:val="single" w:sz="6" w:space="0" w:color="auto"/>
+              <w:right w:val="single" w:sz="2" w:space="0" w:color="auto"/>
+            </w:tcBorders>
+            <w:vAlign w:val="center"/>
+            <w:hideMark/>
+          </w:tcPr>
+          <w:p>
+            <w:r>
+              <w:t>Optimal with real-time adaptation</w:t>
+            </w:r>
+          </w:p>
+        </w:tc>
+      </w:tr>
+      <w:tr>
+        <w:trPr>
+          <w:tblCellSpacing w:w="15" w:type="dxa"/>
+        </w:trPr>
+        <w:tc>
+          <w:tcPr>
+            <w:tcW w:w="0" w:type="auto"/>
+            <w:tcBorders>
+              <w:top w:val="single" w:sz="6" w:space="0" w:color="auto"/>
+              <w:left w:val="single" w:sz="2" w:space="0" w:color="auto"/>
+              <w:bottom w:val="single" w:sz="6" w:space="0" w:color="auto"/>
+              <w:right w:val="single" w:sz="6" w:space="0" w:color="auto"/>
+            </w:tcBorders>
+            <w:vAlign w:val="center"/>
+            <w:hideMark/>
+          </w:tcPr>
+          <w:p>
+            <w:r>
+              <w:t>Edge simulation</w:t>
+            </w:r>
+          </w:p>
+        </w:tc>
+        <w:tc>
+          <w:tcPr>
+            <w:tcW w:w="0" w:type="auto"/>
+            <w:tcBorders>
+              <w:top w:val="single" w:sz="6" w:space="0" w:color="auto"/>
+              <w:left w:val="single" w:sz="6" w:space="0" w:color="auto"/>
+              <w:bottom w:val="single" w:sz="6" w:space="0" w:color="auto"/>
+              <w:right w:val="single" w:sz="6" w:space="0" w:color="auto"/>
+            </w:tcBorders>
+            <w:vAlign w:val="center"/>
+            <w:hideMark/>
+          </w:tcPr>
+          <w:p>
+            <w:r>
+              <w:t>Tick-based with mean reversion</w:t>
+            </w:r>
+          </w:p>
+        </w:tc>
+        <w:tc>
+          <w:tcPr>
+            <w:tcW w:w="0" w:type="auto"/>
+            <w:tcBorders>
+              <w:top w:val="single" w:sz="6" w:space="0" w:color="auto"/>
+              <w:left w:val="single" w:sz="6" w:space="0" w:color="auto"/>
+              <w:bottom w:val="single" w:sz="6" w:space="0" w:color="auto"/>
+              <w:right w:val="single" w:sz="2" w:space="0" w:color="auto"/>
+            </w:tcBorders>
+            <w:vAlign w:val="center"/>
+            <w:hideMark/>
+          </w:tcPr>
+          <w:p>
+            <w:r>
+              <w:t>Realistic traffic patterns</w:t>
+            </w:r>
+          </w:p>
+        </w:tc>
+      </w:tr>
+      <w:tr>
+        <w:trPr>
+          <w:tblCellSpacing w:w="15" w:type="dxa"/>
+        </w:trPr>
+        <w:tc>
+          <w:tcPr>
+            <w:tcW w:w="0" w:type="auto"/>
+            <w:tcBorders>
+              <w:top w:val="single" w:sz="6" w:space="0" w:color="auto"/>
+              <w:left w:val="single" w:sz="2" w:space="0" w:color="auto"/>
+              <w:bottom w:val="single" w:sz="2" w:space="0" w:color="auto"/>
+              <w:right w:val="single" w:sz="6" w:space="0" w:color="auto"/>
+            </w:tcBorders>
+            <w:vAlign w:val="center"/>
+            <w:hideMark/>
+          </w:tcPr>
+          <w:p>
+            <w:r>
+              <w:t>YOLO</w:t>
+            </w:r>
+          </w:p>
+        </w:tc>
+        <w:tc>
+          <w:tcPr>
+            <w:tcW w:w="0" w:type="auto"/>
+            <w:tcBorders>
+              <w:top w:val="single" w:sz="6" w:space="0" w:color="auto"/>
+              <w:left w:val="single" w:sz="6" w:space="0" w:color="auto"/>
+              <w:bottom w:val="single" w:sz="2" w:space="0" w:color="auto"/>
+              <w:right w:val="single" w:sz="6" w:space="0" w:color="auto"/>
+            </w:tcBorders>
+            <w:vAlign w:val="center"/>
+            <w:hideMark/>
+          </w:tcPr>
+          <w:p>
+            <w:r>
+              <w:t>Optional with fallback</w:t>
+            </w:r>
+          </w:p>
+        </w:tc>
+        <w:tc>
+          <w:tcPr>
+            <w:tcW w:w="0" w:type="auto"/>
+            <w:tcBorders>
+              <w:top w:val="single" w:sz="6" w:space="0" w:color="auto"/>
+              <w:left w:val="single" w:sz="6" w:space="0" w:color="auto"/>
+              <w:bottom w:val="single" w:sz="2" w:space="0" w:color="auto"/>
+              <w:right w:val="single" w:sz="2" w:space="0" w:color="auto"/>
+            </w:tcBorders>
+            <w:vAlign w:val="center"/>
+            <w:hideMark/>
+          </w:tcPr>
+          <w:p>
+            <w:r>
+              <w:t>Works without GPU</w:t>
+            </w:r>
+          </w:p>
+        </w:tc>
+      </w:tr>
+    </w:tbl>
+    <w:p>
+      <w:pPr>
+        <w:rPr>
+          <w:b/>
+          <w:bCs/>
+        </w:rPr>
+      </w:pPr>
+      <w:r>
+        <w:rPr>
+          <w:b/>
+          <w:bCs/>
+        </w:rPr>
+        <w:t>Next Steps</w:t>
+      </w:r>
+    </w:p>
+    <w:p>
+      <w:r>
+        <w:t>The following phases are ready to be built:</w:t>
+      </w:r>
+    </w:p>
+    <w:p>
+      <w:pPr>
+        <w:numPr>
+          <w:ilvl w:val="0"/>
+          <w:numId w:val="42"/>
+        </w:numPr>
+      </w:pPr>
+      <w:r>
+        <w:rPr>
+          <w:b/>
+          <w:bCs/>
+        </w:rPr>
+        <w:t>Phase 3</w:t>
+      </w:r>
+      <w:r>
+        <w:t> — Ray compute workers for heavy parallel processing</w:t>
+      </w:r>
+    </w:p>
+    <w:p>
+      <w:pPr>
+        <w:numPr>
+          <w:ilvl w:val="0"/>
+          <w:numId w:val="42"/>
+        </w:numPr>
+      </w:pPr>
+      <w:r>
+        <w:rPr>
+          <w:b/>
+          <w:bCs/>
+        </w:rPr>
+        <w:t>Phase 4</w:t>
+      </w:r>
+      <w:r>
+        <w:t> — Django Channels dashboard with real-time WebSocket UI</w:t>
+      </w:r>
+    </w:p>
+    <w:p>
+      <w:pPr>
+        <w:numPr>
+          <w:ilvl w:val="0"/>
+          <w:numId w:val="42"/>
+        </w:numPr>
+      </w:pPr>
+      <w:r>
+        <w:rPr>
+          <w:b/>
+          <w:bCs/>
+        </w:rPr>
+        <w:t>Phase 5</w:t>
+      </w:r>
+      <w:r>
+        <w:t> — Kubernetes manifests and autoscaling</w:t>
+      </w:r>
+    </w:p>
+    <w:p>
+      <w:pPr>
+        <w:numPr>
+          <w:ilvl w:val="0"/>
+          <w:numId w:val="42"/>
+        </w:numPr>
+      </w:pPr>
+      <w:r>
+        <w:rPr>
+          <w:b/>
+          <w:bCs/>
+        </w:rPr>
+        <w:t>Phase 6</w:t>
+      </w:r>
+      <w:r>
+        <w:t> — Complete monitoring stack (Grafana dashboards)</w:t>
+      </w:r>
+    </w:p>
+    <w:p>
+      <w:pPr>
+        <w:numPr>
+          <w:ilvl w:val="0"/>
+          <w:numId w:val="42"/>
+        </w:numPr>
+      </w:pPr>
+      <w:r>
+        <w:rPr>
+          <w:b/>
+          <w:bCs/>
+        </w:rPr>
+        <w:t>Phase 7</w:t>
+      </w:r>
+      <w:r>
+        <w:t> — Flower federated learning</w:t>
+      </w:r>
+    </w:p>
+    <w:p>
+      <w:pPr>
+        <w:numPr>
+          <w:ilvl w:val="0"/>
+          <w:numId w:val="42"/>
+        </w:numPr>
+      </w:pPr>
+      <w:r>
+        <w:rPr>
+          <w:b/>
+          <w:bCs/>
+        </w:rPr>
+        <w:t>Phase 8</w:t>
+      </w:r>
+      <w:r>
+        <w:t> — Chaos engineering scenarios</w:t>
+      </w:r>
+    </w:p>
+    <w:p>
+      <w:r>
+        <w:t>To Test Now</w:t>
+      </w:r>
+    </w:p>
+    <w:p>
+      <w:r>
+        <w:t>bash</w:t>
+      </w:r>
+    </w:p>
+    <w:p>
+      <w:r>
+        <w:t># Start infrastructure</w:t>
+      </w:r>
+    </w:p>
+    <w:p>
+      <w:r>
+        <w:t xml:space="preserve">docker compose up -d </w:t>
+      </w:r>
+      <w:proofErr w:type="spellStart"/>
+      <w:r>
+        <w:t>kafka</w:t>
+      </w:r>
+      <w:proofErr w:type="spellEnd"/>
+      <w:r>
+        <w:t xml:space="preserve"> </w:t>
+      </w:r>
+      <w:proofErr w:type="spellStart"/>
+      <w:r>
+        <w:t>redis</w:t>
+      </w:r>
+      <w:proofErr w:type="spellEnd"/>
+      <w:r>
+        <w:t xml:space="preserve"> </w:t>
+      </w:r>
+      <w:proofErr w:type="spellStart"/>
+      <w:r>
+        <w:t>postgres</w:t>
+      </w:r>
+      <w:proofErr w:type="spellEnd"/>
+      <w:r>
+        <w:t xml:space="preserve"> </w:t>
+      </w:r>
+      <w:proofErr w:type="spellStart"/>
+      <w:r>
+        <w:t>kafka-init</w:t>
+      </w:r>
+      <w:proofErr w:type="spellEnd"/>
+    </w:p>
+    <w:p>
+      <w:r>
+        <w:t># Start all services</w:t>
+      </w:r>
+    </w:p>
+    <w:p>
+      <w:r>
+        <w:t>docker compose up -d --build</w:t>
+      </w:r>
+    </w:p>
+    <w:p>
+      <w:r>
+        <w:t># Check health</w:t>
+      </w:r>
+    </w:p>
+    <w:p>
+      <w:r>
+        <w:t>curl http://localhost:8001/health</w:t>
+      </w:r>
+    </w:p>
+    <w:p>
+      <w:r>
+        <w:t>curl http://localhost:8002/health</w:t>
+      </w:r>
+    </w:p>
+    <w:p>
+      <w:r>
+        <w:t>curl http://localhost:8003/health</w:t>
+      </w:r>
+    </w:p>
+    <w:p>
+      <w:r>
+        <w:lastRenderedPageBreak/>
+        <w:t>curl http://localhost:8004/health</w:t>
+      </w:r>
+    </w:p>
+    <w:p>
+      <w:r>
+        <w:t>curl http://localhost:8005/health</w:t>
+      </w:r>
+    </w:p>
+    <w:p>
+      <w:r>
+        <w:t># View API docs</w:t>
+      </w:r>
+    </w:p>
+    <w:p>
+      <w:r>
+        <w:t xml:space="preserve"># </w:t>
+      </w:r>
+      <w:proofErr w:type="gramStart"/>
+      <w:r>
+        <w:t>http://localhost:8001/docs  (</w:t>
+      </w:r>
+      <w:proofErr w:type="gramEnd"/>
+      <w:r>
+        <w:t>Traffic)</w:t>
+      </w:r>
+    </w:p>
+    <w:p>
+      <w:r>
+        <w:t xml:space="preserve"># </w:t>
+      </w:r>
+      <w:proofErr w:type="gramStart"/>
+      <w:r>
+        <w:t>http://localhost:8002/docs  (</w:t>
+      </w:r>
+      <w:proofErr w:type="gramEnd"/>
+      <w:r>
+        <w:t>Routing)</w:t>
+      </w:r>
+    </w:p>
+    <w:p>
+      <w:r>
+        <w:t xml:space="preserve"># </w:t>
+      </w:r>
+      <w:proofErr w:type="gramStart"/>
+      <w:r>
+        <w:t>http://localhost:8003/docs  (</w:t>
+      </w:r>
+      <w:proofErr w:type="gramEnd"/>
+      <w:r>
+        <w:t>Analytics)</w:t>
+      </w:r>
+    </w:p>
+    <w:p>
+      <w:r>
+        <w:t xml:space="preserve"># </w:t>
+      </w:r>
+      <w:proofErr w:type="gramStart"/>
+      <w:r>
+        <w:t>http://localhost:8004/docs  (</w:t>
+      </w:r>
+      <w:proofErr w:type="gramEnd"/>
+      <w:r>
+        <w:t>Alerts)</w:t>
+      </w:r>
+    </w:p>
+    <w:p>
+      <w:r>
+        <w:t xml:space="preserve"># </w:t>
+      </w:r>
+      <w:proofErr w:type="gramStart"/>
+      <w:r>
+        <w:t>http://localhost:8005/docs  (</w:t>
+      </w:r>
+      <w:proofErr w:type="gramEnd"/>
+      <w:r>
+        <w:t>Auth)</w:t>
+      </w:r>
+    </w:p>
+    <w:p/>
+    <w:p/>
+    <w:p/>
+    <w:p/>
+    <w:p/>
+    <w:p/>
+    <w:p/>
+    <w:p/>
+    <w:p/>
+    <w:p>
+      <w:r>
+        <w:t xml:space="preserve">To get the </w:t>
+      </w:r>
+      <w:proofErr w:type="spellStart"/>
+      <w:r>
+        <w:t>EdgeCloudX</w:t>
+      </w:r>
+      <w:proofErr w:type="spellEnd"/>
+      <w:r>
+        <w:t xml:space="preserve"> project running, you can use the built-in Windows helper scripts that have been provided in the root directory. </w:t>
+      </w:r>
+    </w:p>
+    <w:p/>
+    <w:p>
+      <w:r>
+        <w:t>Since you are running this for the first time, here is the step-by-step process:</w:t>
+      </w:r>
+    </w:p>
+    <w:p/>
+    <w:p>
+      <w:r>
+        <w:t>### 1. Initial Setup</w:t>
+      </w:r>
+    </w:p>
+    <w:p>
+      <w:r>
+        <w:t xml:space="preserve">Run the setup script from your terminal. This will check your prerequisites (Docker &amp; Python), create a virtual environment, install local dependencies, copy the </w:t>
+      </w:r>
+      <w:proofErr w:type="gramStart"/>
+      <w:r>
+        <w:t>`.env</w:t>
+      </w:r>
+      <w:proofErr w:type="gramEnd"/>
+      <w:r>
+        <w:t>` file, and pull the necessary Docker images.</w:t>
+      </w:r>
+    </w:p>
+    <w:p/>
+    <w:p>
+      <w:r>
+        <w:t>In your terminal or command prompt, run:</w:t>
+      </w:r>
+    </w:p>
+    <w:p>
+      <w:r>
+        <w:t>```</w:t>
+      </w:r>
+      <w:proofErr w:type="spellStart"/>
+      <w:r>
+        <w:t>cmd</w:t>
+      </w:r>
+      <w:proofErr w:type="spellEnd"/>
+    </w:p>
+    <w:p>
+      <w:r>
+        <w:lastRenderedPageBreak/>
+        <w:t>.\setup.bat</w:t>
+      </w:r>
+    </w:p>
+    <w:p>
+      <w:r>
+        <w:t>```</w:t>
+      </w:r>
+    </w:p>
+    <w:p/>
+    <w:p>
+      <w:r>
+        <w:t>### 2. Start the Project</w:t>
+      </w:r>
+    </w:p>
+    <w:p>
+      <w:r>
+        <w:t xml:space="preserve">Once the setup is complete, you can launch the entire stack (Infrastructure + Microservices) using the run helper. </w:t>
+      </w:r>
+    </w:p>
+    <w:p/>
+    <w:p>
+      <w:r>
+        <w:t>```</w:t>
+      </w:r>
+      <w:proofErr w:type="spellStart"/>
+      <w:r>
+        <w:t>cmd</w:t>
+      </w:r>
+      <w:proofErr w:type="spellEnd"/>
+    </w:p>
+    <w:p>
+      <w:r>
+        <w:t>.\run.bat up</w:t>
+      </w:r>
+    </w:p>
+    <w:p>
+      <w:r>
+        <w:t>```</w:t>
+      </w:r>
+    </w:p>
+    <w:p>
+      <w:r>
+        <w:t xml:space="preserve">This command runs `docker compose up -d --build` under the hood. It will spin up Kafka, Redis, PostgreSQL, and all of the </w:t>
+      </w:r>
+      <w:proofErr w:type="spellStart"/>
+      <w:r>
+        <w:t>FastAPI</w:t>
+      </w:r>
+      <w:proofErr w:type="spellEnd"/>
+      <w:r>
+        <w:t xml:space="preserve"> microservices.</w:t>
+      </w:r>
+    </w:p>
+    <w:p/>
+    <w:p>
+      <w:r>
+        <w:t>### 3. Verify Health</w:t>
+      </w:r>
+    </w:p>
+    <w:p>
+      <w:r>
+        <w:t>To confirm that everything is running correctly, you can check the health of all services by running:</w:t>
+      </w:r>
+    </w:p>
+    <w:p>
+      <w:r>
+        <w:t>```</w:t>
+      </w:r>
+      <w:proofErr w:type="spellStart"/>
+      <w:r>
+        <w:t>cmd</w:t>
+      </w:r>
+      <w:proofErr w:type="spellEnd"/>
+    </w:p>
+    <w:p>
+      <w:r>
+        <w:t>.\run.bat health</w:t>
+      </w:r>
+    </w:p>
+    <w:p>
+      <w:r>
+        <w:t>```</w:t>
+      </w:r>
+    </w:p>
+    <w:p>
+      <w:r>
+        <w:t>This will ping the health endpoints of all your microservices and tell you if they are online.</w:t>
+      </w:r>
+    </w:p>
+    <w:p/>
+    <w:p>
+      <w:r>
+        <w:t>### Important URLs</w:t>
+      </w:r>
+    </w:p>
+    <w:p>
+      <w:r>
+        <w:t xml:space="preserve">Once running, each </w:t>
+      </w:r>
+      <w:proofErr w:type="spellStart"/>
+      <w:r>
+        <w:t>FastAPI</w:t>
+      </w:r>
+      <w:proofErr w:type="spellEnd"/>
+      <w:r>
+        <w:t xml:space="preserve"> service will have its own interactive Swagger documentation page where you can test the APIs:</w:t>
+      </w:r>
+    </w:p>
+    <w:p/>
+    <w:p>
+      <w:r>
+        <w:t xml:space="preserve">*   **Traffic </w:t>
+      </w:r>
+      <w:proofErr w:type="gramStart"/>
+      <w:r>
+        <w:t>Service:*</w:t>
+      </w:r>
+      <w:proofErr w:type="gramEnd"/>
+      <w:r>
+        <w:t>* `http://localhost:8001/docs`</w:t>
+      </w:r>
+    </w:p>
+    <w:p>
+      <w:r>
+        <w:t xml:space="preserve">*   **Routing </w:t>
+      </w:r>
+      <w:proofErr w:type="gramStart"/>
+      <w:r>
+        <w:t>Service:*</w:t>
+      </w:r>
+      <w:proofErr w:type="gramEnd"/>
+      <w:r>
+        <w:t>* `http://localhost:8002/docs`</w:t>
+      </w:r>
+    </w:p>
+    <w:p>
+      <w:r>
+        <w:t xml:space="preserve">*   **Analytics </w:t>
+      </w:r>
+      <w:proofErr w:type="gramStart"/>
+      <w:r>
+        <w:t>Service:*</w:t>
+      </w:r>
+      <w:proofErr w:type="gramEnd"/>
+      <w:r>
+        <w:t>* `http://localhost:8003/docs`</w:t>
+      </w:r>
+    </w:p>
+    <w:p>
+      <w:r>
+        <w:t xml:space="preserve">*   **Alert </w:t>
+      </w:r>
+      <w:proofErr w:type="gramStart"/>
+      <w:r>
+        <w:t>Service:*</w:t>
+      </w:r>
+      <w:proofErr w:type="gramEnd"/>
+      <w:r>
+        <w:t>* `http://localhost:8004/docs`</w:t>
+      </w:r>
+    </w:p>
+    <w:p>
+      <w:r>
+        <w:lastRenderedPageBreak/>
+        <w:t xml:space="preserve">*   **Auth </w:t>
+      </w:r>
+      <w:proofErr w:type="gramStart"/>
+      <w:r>
+        <w:t>Service:*</w:t>
+      </w:r>
+      <w:proofErr w:type="gramEnd"/>
+      <w:r>
+        <w:t>* `http://localhost:8005/docs`</w:t>
+      </w:r>
+    </w:p>
+    <w:p/>
+    <w:p>
+      <w:r>
+        <w:t>### Useful Commands for Later</w:t>
+      </w:r>
+    </w:p>
+    <w:p>
+      <w:r>
+        <w:t>You can use `.\run.bat` at any time to manage the project. Here are a few helpful commands:</w:t>
+      </w:r>
+    </w:p>
+    <w:p>
+      <w:r>
+        <w:t>*   `.\run.bat down` - Stops all running services.</w:t>
+      </w:r>
+    </w:p>
+    <w:p>
+      <w:r>
+        <w:t>*   `.\run.bat logs` - Follows the logs for all services (helpful for debugging).</w:t>
+      </w:r>
+    </w:p>
+    <w:p>
+      <w:r>
+        <w:t>*   `.\run.bat clean` - Completely stops and removes all containers, volumes, and networks if you want to start fresh.</w:t>
+      </w:r>
+    </w:p>
     <w:sectPr>
       <w:pgSz w:w="11906" w:h="16838"/>
       <w:pgMar w:top="1440" w:right="1440" w:bottom="1440" w:left="1440" w:header="708" w:footer="708" w:gutter="0"/>
@@ -6874,6 +8999,268 @@
     </w:lvl>
   </w:abstractNum>
   <w:abstractNum w:abstractNumId="3" w15:restartNumberingAfterBreak="0">
+    <w:nsid w:val="0830594B"/>
+    <w:multiLevelType w:val="multilevel"/>
+    <w:tmpl w:val="BBA07D5E"/>
+    <w:lvl w:ilvl="0">
+      <w:start w:val="1"/>
+      <w:numFmt w:val="bullet"/>
+      <w:lvlText w:val=""/>
+      <w:lvlJc w:val="left"/>
+      <w:pPr>
+        <w:tabs>
+          <w:tab w:val="num" w:pos="720"/>
+        </w:tabs>
+        <w:ind w:left="720" w:hanging="360"/>
+      </w:pPr>
+      <w:rPr>
+        <w:rFonts w:ascii="Symbol" w:hAnsi="Symbol" w:hint="default"/>
+        <w:sz w:val="20"/>
+      </w:rPr>
+    </w:lvl>
+    <w:lvl w:ilvl="1" w:tentative="1">
+      <w:start w:val="1"/>
+      <w:numFmt w:val="bullet"/>
+      <w:lvlText w:val=""/>
+      <w:lvlJc w:val="left"/>
+      <w:pPr>
+        <w:tabs>
+          <w:tab w:val="num" w:pos="1440"/>
+        </w:tabs>
+        <w:ind w:left="1440" w:hanging="360"/>
+      </w:pPr>
+      <w:rPr>
+        <w:rFonts w:ascii="Symbol" w:hAnsi="Symbol" w:hint="default"/>
+        <w:sz w:val="20"/>
+      </w:rPr>
+    </w:lvl>
+    <w:lvl w:ilvl="2" w:tentative="1">
+      <w:start w:val="1"/>
+      <w:numFmt w:val="bullet"/>
+      <w:lvlText w:val=""/>
+      <w:lvlJc w:val="left"/>
+      <w:pPr>
+        <w:tabs>
+          <w:tab w:val="num" w:pos="2160"/>
+        </w:tabs>
+        <w:ind w:left="2160" w:hanging="360"/>
+      </w:pPr>
+      <w:rPr>
+        <w:rFonts w:ascii="Symbol" w:hAnsi="Symbol" w:hint="default"/>
+        <w:sz w:val="20"/>
+      </w:rPr>
+    </w:lvl>
+    <w:lvl w:ilvl="3" w:tentative="1">
+      <w:start w:val="1"/>
+      <w:numFmt w:val="bullet"/>
+      <w:lvlText w:val=""/>
+      <w:lvlJc w:val="left"/>
+      <w:pPr>
+        <w:tabs>
+          <w:tab w:val="num" w:pos="2880"/>
+        </w:tabs>
+        <w:ind w:left="2880" w:hanging="360"/>
+      </w:pPr>
+      <w:rPr>
+        <w:rFonts w:ascii="Symbol" w:hAnsi="Symbol" w:hint="default"/>
+        <w:sz w:val="20"/>
+      </w:rPr>
+    </w:lvl>
+    <w:lvl w:ilvl="4" w:tentative="1">
+      <w:start w:val="1"/>
+      <w:numFmt w:val="bullet"/>
+      <w:lvlText w:val=""/>
+      <w:lvlJc w:val="left"/>
+      <w:pPr>
+        <w:tabs>
+          <w:tab w:val="num" w:pos="3600"/>
+        </w:tabs>
+        <w:ind w:left="3600" w:hanging="360"/>
+      </w:pPr>
+      <w:rPr>
+        <w:rFonts w:ascii="Symbol" w:hAnsi="Symbol" w:hint="default"/>
+        <w:sz w:val="20"/>
+      </w:rPr>
+    </w:lvl>
+    <w:lvl w:ilvl="5" w:tentative="1">
+      <w:start w:val="1"/>
+      <w:numFmt w:val="bullet"/>
+      <w:lvlText w:val=""/>
+      <w:lvlJc w:val="left"/>
+      <w:pPr>
+        <w:tabs>
+          <w:tab w:val="num" w:pos="4320"/>
+        </w:tabs>
+        <w:ind w:left="4320" w:hanging="360"/>
+      </w:pPr>
+      <w:rPr>
+        <w:rFonts w:ascii="Symbol" w:hAnsi="Symbol" w:hint="default"/>
+        <w:sz w:val="20"/>
+      </w:rPr>
+    </w:lvl>
+    <w:lvl w:ilvl="6" w:tentative="1">
+      <w:start w:val="1"/>
+      <w:numFmt w:val="bullet"/>
+      <w:lvlText w:val=""/>
+      <w:lvlJc w:val="left"/>
+      <w:pPr>
+        <w:tabs>
+          <w:tab w:val="num" w:pos="5040"/>
+        </w:tabs>
+        <w:ind w:left="5040" w:hanging="360"/>
+      </w:pPr>
+      <w:rPr>
+        <w:rFonts w:ascii="Symbol" w:hAnsi="Symbol" w:hint="default"/>
+        <w:sz w:val="20"/>
+      </w:rPr>
+    </w:lvl>
+    <w:lvl w:ilvl="7" w:tentative="1">
+      <w:start w:val="1"/>
+      <w:numFmt w:val="bullet"/>
+      <w:lvlText w:val=""/>
+      <w:lvlJc w:val="left"/>
+      <w:pPr>
+        <w:tabs>
+          <w:tab w:val="num" w:pos="5760"/>
+        </w:tabs>
+        <w:ind w:left="5760" w:hanging="360"/>
+      </w:pPr>
+      <w:rPr>
+        <w:rFonts w:ascii="Symbol" w:hAnsi="Symbol" w:hint="default"/>
+        <w:sz w:val="20"/>
+      </w:rPr>
+    </w:lvl>
+    <w:lvl w:ilvl="8" w:tentative="1">
+      <w:start w:val="1"/>
+      <w:numFmt w:val="bullet"/>
+      <w:lvlText w:val=""/>
+      <w:lvlJc w:val="left"/>
+      <w:pPr>
+        <w:tabs>
+          <w:tab w:val="num" w:pos="6480"/>
+        </w:tabs>
+        <w:ind w:left="6480" w:hanging="360"/>
+      </w:pPr>
+      <w:rPr>
+        <w:rFonts w:ascii="Symbol" w:hAnsi="Symbol" w:hint="default"/>
+        <w:sz w:val="20"/>
+      </w:rPr>
+    </w:lvl>
+  </w:abstractNum>
+  <w:abstractNum w:abstractNumId="4" w15:restartNumberingAfterBreak="0">
+    <w:nsid w:val="08C22841"/>
+    <w:multiLevelType w:val="multilevel"/>
+    <w:tmpl w:val="2404F486"/>
+    <w:lvl w:ilvl="0">
+      <w:start w:val="1"/>
+      <w:numFmt w:val="decimal"/>
+      <w:lvlText w:val="%1."/>
+      <w:lvlJc w:val="left"/>
+      <w:pPr>
+        <w:tabs>
+          <w:tab w:val="num" w:pos="720"/>
+        </w:tabs>
+        <w:ind w:left="720" w:hanging="360"/>
+      </w:pPr>
+    </w:lvl>
+    <w:lvl w:ilvl="1" w:tentative="1">
+      <w:start w:val="1"/>
+      <w:numFmt w:val="decimal"/>
+      <w:lvlText w:val="%2."/>
+      <w:lvlJc w:val="left"/>
+      <w:pPr>
+        <w:tabs>
+          <w:tab w:val="num" w:pos="1440"/>
+        </w:tabs>
+        <w:ind w:left="1440" w:hanging="360"/>
+      </w:pPr>
+    </w:lvl>
+    <w:lvl w:ilvl="2" w:tentative="1">
+      <w:start w:val="1"/>
+      <w:numFmt w:val="decimal"/>
+      <w:lvlText w:val="%3."/>
+      <w:lvlJc w:val="left"/>
+      <w:pPr>
+        <w:tabs>
+          <w:tab w:val="num" w:pos="2160"/>
+        </w:tabs>
+        <w:ind w:left="2160" w:hanging="360"/>
+      </w:pPr>
+    </w:lvl>
+    <w:lvl w:ilvl="3" w:tentative="1">
+      <w:start w:val="1"/>
+      <w:numFmt w:val="decimal"/>
+      <w:lvlText w:val="%4."/>
+      <w:lvlJc w:val="left"/>
+      <w:pPr>
+        <w:tabs>
+          <w:tab w:val="num" w:pos="2880"/>
+        </w:tabs>
+        <w:ind w:left="2880" w:hanging="360"/>
+      </w:pPr>
+    </w:lvl>
+    <w:lvl w:ilvl="4" w:tentative="1">
+      <w:start w:val="1"/>
+      <w:numFmt w:val="decimal"/>
+      <w:lvlText w:val="%5."/>
+      <w:lvlJc w:val="left"/>
+      <w:pPr>
+        <w:tabs>
+          <w:tab w:val="num" w:pos="3600"/>
+        </w:tabs>
+        <w:ind w:left="3600" w:hanging="360"/>
+      </w:pPr>
+    </w:lvl>
+    <w:lvl w:ilvl="5" w:tentative="1">
+      <w:start w:val="1"/>
+      <w:numFmt w:val="decimal"/>
+      <w:lvlText w:val="%6."/>
+      <w:lvlJc w:val="left"/>
+      <w:pPr>
+        <w:tabs>
+          <w:tab w:val="num" w:pos="4320"/>
+        </w:tabs>
+        <w:ind w:left="4320" w:hanging="360"/>
+      </w:pPr>
+    </w:lvl>
+    <w:lvl w:ilvl="6" w:tentative="1">
+      <w:start w:val="1"/>
+      <w:numFmt w:val="decimal"/>
+      <w:lvlText w:val="%7."/>
+      <w:lvlJc w:val="left"/>
+      <w:pPr>
+        <w:tabs>
+          <w:tab w:val="num" w:pos="5040"/>
+        </w:tabs>
+        <w:ind w:left="5040" w:hanging="360"/>
+      </w:pPr>
+    </w:lvl>
+    <w:lvl w:ilvl="7" w:tentative="1">
+      <w:start w:val="1"/>
+      <w:numFmt w:val="decimal"/>
+      <w:lvlText w:val="%8."/>
+      <w:lvlJc w:val="left"/>
+      <w:pPr>
+        <w:tabs>
+          <w:tab w:val="num" w:pos="5760"/>
+        </w:tabs>
+        <w:ind w:left="5760" w:hanging="360"/>
+      </w:pPr>
+    </w:lvl>
+    <w:lvl w:ilvl="8" w:tentative="1">
+      <w:start w:val="1"/>
+      <w:numFmt w:val="decimal"/>
+      <w:lvlText w:val="%9."/>
+      <w:lvlJc w:val="left"/>
+      <w:pPr>
+        <w:tabs>
+          <w:tab w:val="num" w:pos="6480"/>
+        </w:tabs>
+        <w:ind w:left="6480" w:hanging="360"/>
+      </w:pPr>
+    </w:lvl>
+  </w:abstractNum>
+  <w:abstractNum w:abstractNumId="5" w15:restartNumberingAfterBreak="0">
     <w:nsid w:val="098F7545"/>
     <w:multiLevelType w:val="multilevel"/>
     <w:tmpl w:val="42284A90"/>
@@ -7022,7 +9409,7 @@
       </w:rPr>
     </w:lvl>
   </w:abstractNum>
-  <w:abstractNum w:abstractNumId="4" w15:restartNumberingAfterBreak="0">
+  <w:abstractNum w:abstractNumId="6" w15:restartNumberingAfterBreak="0">
     <w:nsid w:val="1242141F"/>
     <w:multiLevelType w:val="multilevel"/>
     <w:tmpl w:val="51361CC8"/>
@@ -7171,7 +9558,7 @@
       </w:rPr>
     </w:lvl>
   </w:abstractNum>
-  <w:abstractNum w:abstractNumId="5" w15:restartNumberingAfterBreak="0">
+  <w:abstractNum w:abstractNumId="7" w15:restartNumberingAfterBreak="0">
     <w:nsid w:val="1351396F"/>
     <w:multiLevelType w:val="multilevel"/>
     <w:tmpl w:val="0A70DC9E"/>
@@ -7320,7 +9707,7 @@
       </w:rPr>
     </w:lvl>
   </w:abstractNum>
-  <w:abstractNum w:abstractNumId="6" w15:restartNumberingAfterBreak="0">
+  <w:abstractNum w:abstractNumId="8" w15:restartNumberingAfterBreak="0">
     <w:nsid w:val="1C121224"/>
     <w:multiLevelType w:val="multilevel"/>
     <w:tmpl w:val="63563320"/>
@@ -7469,7 +9856,156 @@
       </w:rPr>
     </w:lvl>
   </w:abstractNum>
-  <w:abstractNum w:abstractNumId="7" w15:restartNumberingAfterBreak="0">
+  <w:abstractNum w:abstractNumId="9" w15:restartNumberingAfterBreak="0">
+    <w:nsid w:val="1F791F41"/>
+    <w:multiLevelType w:val="multilevel"/>
+    <w:tmpl w:val="87E27A6E"/>
+    <w:lvl w:ilvl="0">
+      <w:start w:val="1"/>
+      <w:numFmt w:val="bullet"/>
+      <w:lvlText w:val=""/>
+      <w:lvlJc w:val="left"/>
+      <w:pPr>
+        <w:tabs>
+          <w:tab w:val="num" w:pos="720"/>
+        </w:tabs>
+        <w:ind w:left="720" w:hanging="360"/>
+      </w:pPr>
+      <w:rPr>
+        <w:rFonts w:ascii="Symbol" w:hAnsi="Symbol" w:hint="default"/>
+        <w:sz w:val="20"/>
+      </w:rPr>
+    </w:lvl>
+    <w:lvl w:ilvl="1" w:tentative="1">
+      <w:start w:val="1"/>
+      <w:numFmt w:val="bullet"/>
+      <w:lvlText w:val=""/>
+      <w:lvlJc w:val="left"/>
+      <w:pPr>
+        <w:tabs>
+          <w:tab w:val="num" w:pos="1440"/>
+        </w:tabs>
+        <w:ind w:left="1440" w:hanging="360"/>
+      </w:pPr>
+      <w:rPr>
+        <w:rFonts w:ascii="Symbol" w:hAnsi="Symbol" w:hint="default"/>
+        <w:sz w:val="20"/>
+      </w:rPr>
+    </w:lvl>
+    <w:lvl w:ilvl="2" w:tentative="1">
+      <w:start w:val="1"/>
+      <w:numFmt w:val="bullet"/>
+      <w:lvlText w:val=""/>
+      <w:lvlJc w:val="left"/>
+      <w:pPr>
+        <w:tabs>
+          <w:tab w:val="num" w:pos="2160"/>
+        </w:tabs>
+        <w:ind w:left="2160" w:hanging="360"/>
+      </w:pPr>
+      <w:rPr>
+        <w:rFonts w:ascii="Symbol" w:hAnsi="Symbol" w:hint="default"/>
+        <w:sz w:val="20"/>
+      </w:rPr>
+    </w:lvl>
+    <w:lvl w:ilvl="3" w:tentative="1">
+      <w:start w:val="1"/>
+      <w:numFmt w:val="bullet"/>
+      <w:lvlText w:val=""/>
+      <w:lvlJc w:val="left"/>
+      <w:pPr>
+        <w:tabs>
+          <w:tab w:val="num" w:pos="2880"/>
+        </w:tabs>
+        <w:ind w:left="2880" w:hanging="360"/>
+      </w:pPr>
+      <w:rPr>
+        <w:rFonts w:ascii="Symbol" w:hAnsi="Symbol" w:hint="default"/>
+        <w:sz w:val="20"/>
+      </w:rPr>
+    </w:lvl>
+    <w:lvl w:ilvl="4" w:tentative="1">
+      <w:start w:val="1"/>
+      <w:numFmt w:val="bullet"/>
+      <w:lvlText w:val=""/>
+      <w:lvlJc w:val="left"/>
+      <w:pPr>
+        <w:tabs>
+          <w:tab w:val="num" w:pos="3600"/>
+        </w:tabs>
+        <w:ind w:left="3600" w:hanging="360"/>
+      </w:pPr>
+      <w:rPr>
+        <w:rFonts w:ascii="Symbol" w:hAnsi="Symbol" w:hint="default"/>
+        <w:sz w:val="20"/>
+      </w:rPr>
+    </w:lvl>
+    <w:lvl w:ilvl="5" w:tentative="1">
+      <w:start w:val="1"/>
+      <w:numFmt w:val="bullet"/>
+      <w:lvlText w:val=""/>
+      <w:lvlJc w:val="left"/>
+      <w:pPr>
+        <w:tabs>
+          <w:tab w:val="num" w:pos="4320"/>
+        </w:tabs>
+        <w:ind w:left="4320" w:hanging="360"/>
+      </w:pPr>
+      <w:rPr>
+        <w:rFonts w:ascii="Symbol" w:hAnsi="Symbol" w:hint="default"/>
+        <w:sz w:val="20"/>
+      </w:rPr>
+    </w:lvl>
+    <w:lvl w:ilvl="6" w:tentative="1">
+      <w:start w:val="1"/>
+      <w:numFmt w:val="bullet"/>
+      <w:lvlText w:val=""/>
+      <w:lvlJc w:val="left"/>
+      <w:pPr>
+        <w:tabs>
+          <w:tab w:val="num" w:pos="5040"/>
+        </w:tabs>
+        <w:ind w:left="5040" w:hanging="360"/>
+      </w:pPr>
+      <w:rPr>
+        <w:rFonts w:ascii="Symbol" w:hAnsi="Symbol" w:hint="default"/>
+        <w:sz w:val="20"/>
+      </w:rPr>
+    </w:lvl>
+    <w:lvl w:ilvl="7" w:tentative="1">
+      <w:start w:val="1"/>
+      <w:numFmt w:val="bullet"/>
+      <w:lvlText w:val=""/>
+      <w:lvlJc w:val="left"/>
+      <w:pPr>
+        <w:tabs>
+          <w:tab w:val="num" w:pos="5760"/>
+        </w:tabs>
+        <w:ind w:left="5760" w:hanging="360"/>
+      </w:pPr>
+      <w:rPr>
+        <w:rFonts w:ascii="Symbol" w:hAnsi="Symbol" w:hint="default"/>
+        <w:sz w:val="20"/>
+      </w:rPr>
+    </w:lvl>
+    <w:lvl w:ilvl="8" w:tentative="1">
+      <w:start w:val="1"/>
+      <w:numFmt w:val="bullet"/>
+      <w:lvlText w:val=""/>
+      <w:lvlJc w:val="left"/>
+      <w:pPr>
+        <w:tabs>
+          <w:tab w:val="num" w:pos="6480"/>
+        </w:tabs>
+        <w:ind w:left="6480" w:hanging="360"/>
+      </w:pPr>
+      <w:rPr>
+        <w:rFonts w:ascii="Symbol" w:hAnsi="Symbol" w:hint="default"/>
+        <w:sz w:val="20"/>
+      </w:rPr>
+    </w:lvl>
+  </w:abstractNum>
+  <w:abstractNum w:abstractNumId="10" w15:restartNumberingAfterBreak="0">
     <w:nsid w:val="1F9832D8"/>
     <w:multiLevelType w:val="multilevel"/>
     <w:tmpl w:val="95CC46FA"/>
@@ -7618,7 +10154,7 @@
       </w:rPr>
     </w:lvl>
   </w:abstractNum>
-  <w:abstractNum w:abstractNumId="8" w15:restartNumberingAfterBreak="0">
+  <w:abstractNum w:abstractNumId="11" w15:restartNumberingAfterBreak="0">
     <w:nsid w:val="2206678F"/>
     <w:multiLevelType w:val="multilevel"/>
     <w:tmpl w:val="5928B322"/>
@@ -7767,7 +10303,7 @@
       </w:rPr>
     </w:lvl>
   </w:abstractNum>
-  <w:abstractNum w:abstractNumId="9" w15:restartNumberingAfterBreak="0">
+  <w:abstractNum w:abstractNumId="12" w15:restartNumberingAfterBreak="0">
     <w:nsid w:val="243E0BA6"/>
     <w:multiLevelType w:val="multilevel"/>
     <w:tmpl w:val="1292D1E8"/>
@@ -7916,7 +10452,7 @@
       </w:rPr>
     </w:lvl>
   </w:abstractNum>
-  <w:abstractNum w:abstractNumId="10" w15:restartNumberingAfterBreak="0">
+  <w:abstractNum w:abstractNumId="13" w15:restartNumberingAfterBreak="0">
     <w:nsid w:val="26387437"/>
     <w:multiLevelType w:val="multilevel"/>
     <w:tmpl w:val="76587410"/>
@@ -8065,7 +10601,156 @@
       </w:rPr>
     </w:lvl>
   </w:abstractNum>
-  <w:abstractNum w:abstractNumId="11" w15:restartNumberingAfterBreak="0">
+  <w:abstractNum w:abstractNumId="14" w15:restartNumberingAfterBreak="0">
+    <w:nsid w:val="2BEF193E"/>
+    <w:multiLevelType w:val="multilevel"/>
+    <w:tmpl w:val="1F100224"/>
+    <w:lvl w:ilvl="0">
+      <w:start w:val="1"/>
+      <w:numFmt w:val="bullet"/>
+      <w:lvlText w:val=""/>
+      <w:lvlJc w:val="left"/>
+      <w:pPr>
+        <w:tabs>
+          <w:tab w:val="num" w:pos="720"/>
+        </w:tabs>
+        <w:ind w:left="720" w:hanging="360"/>
+      </w:pPr>
+      <w:rPr>
+        <w:rFonts w:ascii="Symbol" w:hAnsi="Symbol" w:hint="default"/>
+        <w:sz w:val="20"/>
+      </w:rPr>
+    </w:lvl>
+    <w:lvl w:ilvl="1" w:tentative="1">
+      <w:start w:val="1"/>
+      <w:numFmt w:val="bullet"/>
+      <w:lvlText w:val=""/>
+      <w:lvlJc w:val="left"/>
+      <w:pPr>
+        <w:tabs>
+          <w:tab w:val="num" w:pos="1440"/>
+        </w:tabs>
+        <w:ind w:left="1440" w:hanging="360"/>
+      </w:pPr>
+      <w:rPr>
+        <w:rFonts w:ascii="Symbol" w:hAnsi="Symbol" w:hint="default"/>
+        <w:sz w:val="20"/>
+      </w:rPr>
+    </w:lvl>
+    <w:lvl w:ilvl="2" w:tentative="1">
+      <w:start w:val="1"/>
+      <w:numFmt w:val="bullet"/>
+      <w:lvlText w:val=""/>
+      <w:lvlJc w:val="left"/>
+      <w:pPr>
+        <w:tabs>
+          <w:tab w:val="num" w:pos="2160"/>
+        </w:tabs>
+        <w:ind w:left="2160" w:hanging="360"/>
+      </w:pPr>
+      <w:rPr>
+        <w:rFonts w:ascii="Symbol" w:hAnsi="Symbol" w:hint="default"/>
+        <w:sz w:val="20"/>
+      </w:rPr>
+    </w:lvl>
+    <w:lvl w:ilvl="3" w:tentative="1">
+      <w:start w:val="1"/>
+      <w:numFmt w:val="bullet"/>
+      <w:lvlText w:val=""/>
+      <w:lvlJc w:val="left"/>
+      <w:pPr>
+        <w:tabs>
+          <w:tab w:val="num" w:pos="2880"/>
+        </w:tabs>
+        <w:ind w:left="2880" w:hanging="360"/>
+      </w:pPr>
+      <w:rPr>
+        <w:rFonts w:ascii="Symbol" w:hAnsi="Symbol" w:hint="default"/>
+        <w:sz w:val="20"/>
+      </w:rPr>
+    </w:lvl>
+    <w:lvl w:ilvl="4" w:tentative="1">
+      <w:start w:val="1"/>
+      <w:numFmt w:val="bullet"/>
+      <w:lvlText w:val=""/>
+      <w:lvlJc w:val="left"/>
+      <w:pPr>
+        <w:tabs>
+          <w:tab w:val="num" w:pos="3600"/>
+        </w:tabs>
+        <w:ind w:left="3600" w:hanging="360"/>
+      </w:pPr>
+      <w:rPr>
+        <w:rFonts w:ascii="Symbol" w:hAnsi="Symbol" w:hint="default"/>
+        <w:sz w:val="20"/>
+      </w:rPr>
+    </w:lvl>
+    <w:lvl w:ilvl="5" w:tentative="1">
+      <w:start w:val="1"/>
+      <w:numFmt w:val="bullet"/>
+      <w:lvlText w:val=""/>
+      <w:lvlJc w:val="left"/>
+      <w:pPr>
+        <w:tabs>
+          <w:tab w:val="num" w:pos="4320"/>
+        </w:tabs>
+        <w:ind w:left="4320" w:hanging="360"/>
+      </w:pPr>
+      <w:rPr>
+        <w:rFonts w:ascii="Symbol" w:hAnsi="Symbol" w:hint="default"/>
+        <w:sz w:val="20"/>
+      </w:rPr>
+    </w:lvl>
+    <w:lvl w:ilvl="6" w:tentative="1">
+      <w:start w:val="1"/>
+      <w:numFmt w:val="bullet"/>
+      <w:lvlText w:val=""/>
+      <w:lvlJc w:val="left"/>
+      <w:pPr>
+        <w:tabs>
+          <w:tab w:val="num" w:pos="5040"/>
+        </w:tabs>
+        <w:ind w:left="5040" w:hanging="360"/>
+      </w:pPr>
+      <w:rPr>
+        <w:rFonts w:ascii="Symbol" w:hAnsi="Symbol" w:hint="default"/>
+        <w:sz w:val="20"/>
+      </w:rPr>
+    </w:lvl>
+    <w:lvl w:ilvl="7" w:tentative="1">
+      <w:start w:val="1"/>
+      <w:numFmt w:val="bullet"/>
+      <w:lvlText w:val=""/>
+      <w:lvlJc w:val="left"/>
+      <w:pPr>
+        <w:tabs>
+          <w:tab w:val="num" w:pos="5760"/>
+        </w:tabs>
+        <w:ind w:left="5760" w:hanging="360"/>
+      </w:pPr>
+      <w:rPr>
+        <w:rFonts w:ascii="Symbol" w:hAnsi="Symbol" w:hint="default"/>
+        <w:sz w:val="20"/>
+      </w:rPr>
+    </w:lvl>
+    <w:lvl w:ilvl="8" w:tentative="1">
+      <w:start w:val="1"/>
+      <w:numFmt w:val="bullet"/>
+      <w:lvlText w:val=""/>
+      <w:lvlJc w:val="left"/>
+      <w:pPr>
+        <w:tabs>
+          <w:tab w:val="num" w:pos="6480"/>
+        </w:tabs>
+        <w:ind w:left="6480" w:hanging="360"/>
+      </w:pPr>
+      <w:rPr>
+        <w:rFonts w:ascii="Symbol" w:hAnsi="Symbol" w:hint="default"/>
+        <w:sz w:val="20"/>
+      </w:rPr>
+    </w:lvl>
+  </w:abstractNum>
+  <w:abstractNum w:abstractNumId="15" w15:restartNumberingAfterBreak="0">
     <w:nsid w:val="2F48239D"/>
     <w:multiLevelType w:val="multilevel"/>
     <w:tmpl w:val="FA9E4348"/>
@@ -8214,7 +10899,7 @@
       </w:rPr>
     </w:lvl>
   </w:abstractNum>
-  <w:abstractNum w:abstractNumId="12" w15:restartNumberingAfterBreak="0">
+  <w:abstractNum w:abstractNumId="16" w15:restartNumberingAfterBreak="0">
     <w:nsid w:val="32C86EE5"/>
     <w:multiLevelType w:val="multilevel"/>
     <w:tmpl w:val="3FF2BB2E"/>
@@ -8363,7 +11048,7 @@
       </w:rPr>
     </w:lvl>
   </w:abstractNum>
-  <w:abstractNum w:abstractNumId="13" w15:restartNumberingAfterBreak="0">
+  <w:abstractNum w:abstractNumId="17" w15:restartNumberingAfterBreak="0">
     <w:nsid w:val="353F5E0E"/>
     <w:multiLevelType w:val="multilevel"/>
     <w:tmpl w:val="307A1EEE"/>
@@ -8512,7 +11197,7 @@
       </w:rPr>
     </w:lvl>
   </w:abstractNum>
-  <w:abstractNum w:abstractNumId="14" w15:restartNumberingAfterBreak="0">
+  <w:abstractNum w:abstractNumId="18" w15:restartNumberingAfterBreak="0">
     <w:nsid w:val="36BE6575"/>
     <w:multiLevelType w:val="multilevel"/>
     <w:tmpl w:val="F1726522"/>
@@ -8661,7 +11346,269 @@
       </w:rPr>
     </w:lvl>
   </w:abstractNum>
-  <w:abstractNum w:abstractNumId="15" w15:restartNumberingAfterBreak="0">
+  <w:abstractNum w:abstractNumId="19" w15:restartNumberingAfterBreak="0">
+    <w:nsid w:val="37DF2A0A"/>
+    <w:multiLevelType w:val="multilevel"/>
+    <w:tmpl w:val="FA4252A8"/>
+    <w:lvl w:ilvl="0">
+      <w:start w:val="1"/>
+      <w:numFmt w:val="bullet"/>
+      <w:lvlText w:val=""/>
+      <w:lvlJc w:val="left"/>
+      <w:pPr>
+        <w:tabs>
+          <w:tab w:val="num" w:pos="720"/>
+        </w:tabs>
+        <w:ind w:left="720" w:hanging="360"/>
+      </w:pPr>
+      <w:rPr>
+        <w:rFonts w:ascii="Symbol" w:hAnsi="Symbol" w:hint="default"/>
+        <w:sz w:val="20"/>
+      </w:rPr>
+    </w:lvl>
+    <w:lvl w:ilvl="1" w:tentative="1">
+      <w:start w:val="1"/>
+      <w:numFmt w:val="bullet"/>
+      <w:lvlText w:val=""/>
+      <w:lvlJc w:val="left"/>
+      <w:pPr>
+        <w:tabs>
+          <w:tab w:val="num" w:pos="1440"/>
+        </w:tabs>
+        <w:ind w:left="1440" w:hanging="360"/>
+      </w:pPr>
+      <w:rPr>
+        <w:rFonts w:ascii="Symbol" w:hAnsi="Symbol" w:hint="default"/>
+        <w:sz w:val="20"/>
+      </w:rPr>
+    </w:lvl>
+    <w:lvl w:ilvl="2" w:tentative="1">
+      <w:start w:val="1"/>
+      <w:numFmt w:val="bullet"/>
+      <w:lvlText w:val=""/>
+      <w:lvlJc w:val="left"/>
+      <w:pPr>
+        <w:tabs>
+          <w:tab w:val="num" w:pos="2160"/>
+        </w:tabs>
+        <w:ind w:left="2160" w:hanging="360"/>
+      </w:pPr>
+      <w:rPr>
+        <w:rFonts w:ascii="Symbol" w:hAnsi="Symbol" w:hint="default"/>
+        <w:sz w:val="20"/>
+      </w:rPr>
+    </w:lvl>
+    <w:lvl w:ilvl="3" w:tentative="1">
+      <w:start w:val="1"/>
+      <w:numFmt w:val="bullet"/>
+      <w:lvlText w:val=""/>
+      <w:lvlJc w:val="left"/>
+      <w:pPr>
+        <w:tabs>
+          <w:tab w:val="num" w:pos="2880"/>
+        </w:tabs>
+        <w:ind w:left="2880" w:hanging="360"/>
+      </w:pPr>
+      <w:rPr>
+        <w:rFonts w:ascii="Symbol" w:hAnsi="Symbol" w:hint="default"/>
+        <w:sz w:val="20"/>
+      </w:rPr>
+    </w:lvl>
+    <w:lvl w:ilvl="4" w:tentative="1">
+      <w:start w:val="1"/>
+      <w:numFmt w:val="bullet"/>
+      <w:lvlText w:val=""/>
+      <w:lvlJc w:val="left"/>
+      <w:pPr>
+        <w:tabs>
+          <w:tab w:val="num" w:pos="3600"/>
+        </w:tabs>
+        <w:ind w:left="3600" w:hanging="360"/>
+      </w:pPr>
+      <w:rPr>
+        <w:rFonts w:ascii="Symbol" w:hAnsi="Symbol" w:hint="default"/>
+        <w:sz w:val="20"/>
+      </w:rPr>
+    </w:lvl>
+    <w:lvl w:ilvl="5" w:tentative="1">
+      <w:start w:val="1"/>
+      <w:numFmt w:val="bullet"/>
+      <w:lvlText w:val=""/>
+      <w:lvlJc w:val="left"/>
+      <w:pPr>
+        <w:tabs>
+          <w:tab w:val="num" w:pos="4320"/>
+        </w:tabs>
+        <w:ind w:left="4320" w:hanging="360"/>
+      </w:pPr>
+      <w:rPr>
+        <w:rFonts w:ascii="Symbol" w:hAnsi="Symbol" w:hint="default"/>
+        <w:sz w:val="20"/>
+      </w:rPr>
+    </w:lvl>
+    <w:lvl w:ilvl="6" w:tentative="1">
+      <w:start w:val="1"/>
+      <w:numFmt w:val="bullet"/>
+      <w:lvlText w:val=""/>
+      <w:lvlJc w:val="left"/>
+      <w:pPr>
+        <w:tabs>
+          <w:tab w:val="num" w:pos="5040"/>
+        </w:tabs>
+        <w:ind w:left="5040" w:hanging="360"/>
+      </w:pPr>
+      <w:rPr>
+        <w:rFonts w:ascii="Symbol" w:hAnsi="Symbol" w:hint="default"/>
+        <w:sz w:val="20"/>
+      </w:rPr>
+    </w:lvl>
+    <w:lvl w:ilvl="7" w:tentative="1">
+      <w:start w:val="1"/>
+      <w:numFmt w:val="bullet"/>
+      <w:lvlText w:val=""/>
+      <w:lvlJc w:val="left"/>
+      <w:pPr>
+        <w:tabs>
+          <w:tab w:val="num" w:pos="5760"/>
+        </w:tabs>
+        <w:ind w:left="5760" w:hanging="360"/>
+      </w:pPr>
+      <w:rPr>
+        <w:rFonts w:ascii="Symbol" w:hAnsi="Symbol" w:hint="default"/>
+        <w:sz w:val="20"/>
+      </w:rPr>
+    </w:lvl>
+    <w:lvl w:ilvl="8" w:tentative="1">
+      <w:start w:val="1"/>
+      <w:numFmt w:val="bullet"/>
+      <w:lvlText w:val=""/>
+      <w:lvlJc w:val="left"/>
+      <w:pPr>
+        <w:tabs>
+          <w:tab w:val="num" w:pos="6480"/>
+        </w:tabs>
+        <w:ind w:left="6480" w:hanging="360"/>
+      </w:pPr>
+      <w:rPr>
+        <w:rFonts w:ascii="Symbol" w:hAnsi="Symbol" w:hint="default"/>
+        <w:sz w:val="20"/>
+      </w:rPr>
+    </w:lvl>
+  </w:abstractNum>
+  <w:abstractNum w:abstractNumId="20" w15:restartNumberingAfterBreak="0">
+    <w:nsid w:val="425E5F0B"/>
+    <w:multiLevelType w:val="multilevel"/>
+    <w:tmpl w:val="0B4EF8B6"/>
+    <w:lvl w:ilvl="0">
+      <w:start w:val="1"/>
+      <w:numFmt w:val="decimal"/>
+      <w:lvlText w:val="%1."/>
+      <w:lvlJc w:val="left"/>
+      <w:pPr>
+        <w:tabs>
+          <w:tab w:val="num" w:pos="720"/>
+        </w:tabs>
+        <w:ind w:left="720" w:hanging="360"/>
+      </w:pPr>
+    </w:lvl>
+    <w:lvl w:ilvl="1" w:tentative="1">
+      <w:start w:val="1"/>
+      <w:numFmt w:val="decimal"/>
+      <w:lvlText w:val="%2."/>
+      <w:lvlJc w:val="left"/>
+      <w:pPr>
+        <w:tabs>
+          <w:tab w:val="num" w:pos="1440"/>
+        </w:tabs>
+        <w:ind w:left="1440" w:hanging="360"/>
+      </w:pPr>
+    </w:lvl>
+    <w:lvl w:ilvl="2" w:tentative="1">
+      <w:start w:val="1"/>
+      <w:numFmt w:val="decimal"/>
+      <w:lvlText w:val="%3."/>
+      <w:lvlJc w:val="left"/>
+      <w:pPr>
+        <w:tabs>
+          <w:tab w:val="num" w:pos="2160"/>
+        </w:tabs>
+        <w:ind w:left="2160" w:hanging="360"/>
+      </w:pPr>
+    </w:lvl>
+    <w:lvl w:ilvl="3" w:tentative="1">
+      <w:start w:val="1"/>
+      <w:numFmt w:val="decimal"/>
+      <w:lvlText w:val="%4."/>
+      <w:lvlJc w:val="left"/>
+      <w:pPr>
+        <w:tabs>
+          <w:tab w:val="num" w:pos="2880"/>
+        </w:tabs>
+        <w:ind w:left="2880" w:hanging="360"/>
+      </w:pPr>
+    </w:lvl>
+    <w:lvl w:ilvl="4" w:tentative="1">
+      <w:start w:val="1"/>
+      <w:numFmt w:val="decimal"/>
+      <w:lvlText w:val="%5."/>
+      <w:lvlJc w:val="left"/>
+      <w:pPr>
+        <w:tabs>
+          <w:tab w:val="num" w:pos="3600"/>
+        </w:tabs>
+        <w:ind w:left="3600" w:hanging="360"/>
+      </w:pPr>
+    </w:lvl>
+    <w:lvl w:ilvl="5" w:tentative="1">
+      <w:start w:val="1"/>
+      <w:numFmt w:val="decimal"/>
+      <w:lvlText w:val="%6."/>
+      <w:lvlJc w:val="left"/>
+      <w:pPr>
+        <w:tabs>
+          <w:tab w:val="num" w:pos="4320"/>
+        </w:tabs>
+        <w:ind w:left="4320" w:hanging="360"/>
+      </w:pPr>
+    </w:lvl>
+    <w:lvl w:ilvl="6" w:tentative="1">
+      <w:start w:val="1"/>
+      <w:numFmt w:val="decimal"/>
+      <w:lvlText w:val="%7."/>
+      <w:lvlJc w:val="left"/>
+      <w:pPr>
+        <w:tabs>
+          <w:tab w:val="num" w:pos="5040"/>
+        </w:tabs>
+        <w:ind w:left="5040" w:hanging="360"/>
+      </w:pPr>
+    </w:lvl>
+    <w:lvl w:ilvl="7" w:tentative="1">
+      <w:start w:val="1"/>
+      <w:numFmt w:val="decimal"/>
+      <w:lvlText w:val="%8."/>
+      <w:lvlJc w:val="left"/>
+      <w:pPr>
+        <w:tabs>
+          <w:tab w:val="num" w:pos="5760"/>
+        </w:tabs>
+        <w:ind w:left="5760" w:hanging="360"/>
+      </w:pPr>
+    </w:lvl>
+    <w:lvl w:ilvl="8" w:tentative="1">
+      <w:start w:val="1"/>
+      <w:numFmt w:val="decimal"/>
+      <w:lvlText w:val="%9."/>
+      <w:lvlJc w:val="left"/>
+      <w:pPr>
+        <w:tabs>
+          <w:tab w:val="num" w:pos="6480"/>
+        </w:tabs>
+        <w:ind w:left="6480" w:hanging="360"/>
+      </w:pPr>
+    </w:lvl>
+  </w:abstractNum>
+  <w:abstractNum w:abstractNumId="21" w15:restartNumberingAfterBreak="0">
     <w:nsid w:val="44437A32"/>
     <w:multiLevelType w:val="multilevel"/>
     <w:tmpl w:val="5DA87BB2"/>
@@ -8810,7 +11757,7 @@
       </w:rPr>
     </w:lvl>
   </w:abstractNum>
-  <w:abstractNum w:abstractNumId="16" w15:restartNumberingAfterBreak="0">
+  <w:abstractNum w:abstractNumId="22" w15:restartNumberingAfterBreak="0">
     <w:nsid w:val="491A40FE"/>
     <w:multiLevelType w:val="multilevel"/>
     <w:tmpl w:val="3426056E"/>
@@ -8959,7 +11906,7 @@
       </w:rPr>
     </w:lvl>
   </w:abstractNum>
-  <w:abstractNum w:abstractNumId="17" w15:restartNumberingAfterBreak="0">
+  <w:abstractNum w:abstractNumId="23" w15:restartNumberingAfterBreak="0">
     <w:nsid w:val="4A874E95"/>
     <w:multiLevelType w:val="multilevel"/>
     <w:tmpl w:val="05340EEE"/>
@@ -9108,7 +12055,7 @@
       </w:rPr>
     </w:lvl>
   </w:abstractNum>
-  <w:abstractNum w:abstractNumId="18" w15:restartNumberingAfterBreak="0">
+  <w:abstractNum w:abstractNumId="24" w15:restartNumberingAfterBreak="0">
     <w:nsid w:val="4B443A24"/>
     <w:multiLevelType w:val="multilevel"/>
     <w:tmpl w:val="7A42AF82"/>
@@ -9257,7 +12204,156 @@
       </w:rPr>
     </w:lvl>
   </w:abstractNum>
-  <w:abstractNum w:abstractNumId="19" w15:restartNumberingAfterBreak="0">
+  <w:abstractNum w:abstractNumId="25" w15:restartNumberingAfterBreak="0">
+    <w:nsid w:val="502A258F"/>
+    <w:multiLevelType w:val="multilevel"/>
+    <w:tmpl w:val="503EDF22"/>
+    <w:lvl w:ilvl="0">
+      <w:start w:val="1"/>
+      <w:numFmt w:val="bullet"/>
+      <w:lvlText w:val=""/>
+      <w:lvlJc w:val="left"/>
+      <w:pPr>
+        <w:tabs>
+          <w:tab w:val="num" w:pos="720"/>
+        </w:tabs>
+        <w:ind w:left="720" w:hanging="360"/>
+      </w:pPr>
+      <w:rPr>
+        <w:rFonts w:ascii="Symbol" w:hAnsi="Symbol" w:hint="default"/>
+        <w:sz w:val="20"/>
+      </w:rPr>
+    </w:lvl>
+    <w:lvl w:ilvl="1" w:tentative="1">
+      <w:start w:val="1"/>
+      <w:numFmt w:val="bullet"/>
+      <w:lvlText w:val=""/>
+      <w:lvlJc w:val="left"/>
+      <w:pPr>
+        <w:tabs>
+          <w:tab w:val="num" w:pos="1440"/>
+        </w:tabs>
+        <w:ind w:left="1440" w:hanging="360"/>
+      </w:pPr>
+      <w:rPr>
+        <w:rFonts w:ascii="Symbol" w:hAnsi="Symbol" w:hint="default"/>
+        <w:sz w:val="20"/>
+      </w:rPr>
+    </w:lvl>
+    <w:lvl w:ilvl="2" w:tentative="1">
+      <w:start w:val="1"/>
+      <w:numFmt w:val="bullet"/>
+      <w:lvlText w:val=""/>
+      <w:lvlJc w:val="left"/>
+      <w:pPr>
+        <w:tabs>
+          <w:tab w:val="num" w:pos="2160"/>
+        </w:tabs>
+        <w:ind w:left="2160" w:hanging="360"/>
+      </w:pPr>
+      <w:rPr>
+        <w:rFonts w:ascii="Symbol" w:hAnsi="Symbol" w:hint="default"/>
+        <w:sz w:val="20"/>
+      </w:rPr>
+    </w:lvl>
+    <w:lvl w:ilvl="3" w:tentative="1">
+      <w:start w:val="1"/>
+      <w:numFmt w:val="bullet"/>
+      <w:lvlText w:val=""/>
+      <w:lvlJc w:val="left"/>
+      <w:pPr>
+        <w:tabs>
+          <w:tab w:val="num" w:pos="2880"/>
+        </w:tabs>
+        <w:ind w:left="2880" w:hanging="360"/>
+      </w:pPr>
+      <w:rPr>
+        <w:rFonts w:ascii="Symbol" w:hAnsi="Symbol" w:hint="default"/>
+        <w:sz w:val="20"/>
+      </w:rPr>
+    </w:lvl>
+    <w:lvl w:ilvl="4" w:tentative="1">
+      <w:start w:val="1"/>
+      <w:numFmt w:val="bullet"/>
+      <w:lvlText w:val=""/>
+      <w:lvlJc w:val="left"/>
+      <w:pPr>
+        <w:tabs>
+          <w:tab w:val="num" w:pos="3600"/>
+        </w:tabs>
+        <w:ind w:left="3600" w:hanging="360"/>
+      </w:pPr>
+      <w:rPr>
+        <w:rFonts w:ascii="Symbol" w:hAnsi="Symbol" w:hint="default"/>
+        <w:sz w:val="20"/>
+      </w:rPr>
+    </w:lvl>
+    <w:lvl w:ilvl="5" w:tentative="1">
+      <w:start w:val="1"/>
+      <w:numFmt w:val="bullet"/>
+      <w:lvlText w:val=""/>
+      <w:lvlJc w:val="left"/>
+      <w:pPr>
+        <w:tabs>
+          <w:tab w:val="num" w:pos="4320"/>
+        </w:tabs>
+        <w:ind w:left="4320" w:hanging="360"/>
+      </w:pPr>
+      <w:rPr>
+        <w:rFonts w:ascii="Symbol" w:hAnsi="Symbol" w:hint="default"/>
+        <w:sz w:val="20"/>
+      </w:rPr>
+    </w:lvl>
+    <w:lvl w:ilvl="6" w:tentative="1">
+      <w:start w:val="1"/>
+      <w:numFmt w:val="bullet"/>
+      <w:lvlText w:val=""/>
+      <w:lvlJc w:val="left"/>
+      <w:pPr>
+        <w:tabs>
+          <w:tab w:val="num" w:pos="5040"/>
+        </w:tabs>
+        <w:ind w:left="5040" w:hanging="360"/>
+      </w:pPr>
+      <w:rPr>
+        <w:rFonts w:ascii="Symbol" w:hAnsi="Symbol" w:hint="default"/>
+        <w:sz w:val="20"/>
+      </w:rPr>
+    </w:lvl>
+    <w:lvl w:ilvl="7" w:tentative="1">
+      <w:start w:val="1"/>
+      <w:numFmt w:val="bullet"/>
+      <w:lvlText w:val=""/>
+      <w:lvlJc w:val="left"/>
+      <w:pPr>
+        <w:tabs>
+          <w:tab w:val="num" w:pos="5760"/>
+        </w:tabs>
+        <w:ind w:left="5760" w:hanging="360"/>
+      </w:pPr>
+      <w:rPr>
+        <w:rFonts w:ascii="Symbol" w:hAnsi="Symbol" w:hint="default"/>
+        <w:sz w:val="20"/>
+      </w:rPr>
+    </w:lvl>
+    <w:lvl w:ilvl="8" w:tentative="1">
+      <w:start w:val="1"/>
+      <w:numFmt w:val="bullet"/>
+      <w:lvlText w:val=""/>
+      <w:lvlJc w:val="left"/>
+      <w:pPr>
+        <w:tabs>
+          <w:tab w:val="num" w:pos="6480"/>
+        </w:tabs>
+        <w:ind w:left="6480" w:hanging="360"/>
+      </w:pPr>
+      <w:rPr>
+        <w:rFonts w:ascii="Symbol" w:hAnsi="Symbol" w:hint="default"/>
+        <w:sz w:val="20"/>
+      </w:rPr>
+    </w:lvl>
+  </w:abstractNum>
+  <w:abstractNum w:abstractNumId="26" w15:restartNumberingAfterBreak="0">
     <w:nsid w:val="51696E82"/>
     <w:multiLevelType w:val="multilevel"/>
     <w:tmpl w:val="9FD8A174"/>
@@ -9406,7 +12502,7 @@
       </w:rPr>
     </w:lvl>
   </w:abstractNum>
-  <w:abstractNum w:abstractNumId="20" w15:restartNumberingAfterBreak="0">
+  <w:abstractNum w:abstractNumId="27" w15:restartNumberingAfterBreak="0">
     <w:nsid w:val="597777C0"/>
     <w:multiLevelType w:val="multilevel"/>
     <w:tmpl w:val="C764C1FC"/>
@@ -9555,7 +12651,7 @@
       </w:rPr>
     </w:lvl>
   </w:abstractNum>
-  <w:abstractNum w:abstractNumId="21" w15:restartNumberingAfterBreak="0">
+  <w:abstractNum w:abstractNumId="28" w15:restartNumberingAfterBreak="0">
     <w:nsid w:val="5D606670"/>
     <w:multiLevelType w:val="multilevel"/>
     <w:tmpl w:val="51245816"/>
@@ -9704,7 +12800,156 @@
       </w:rPr>
     </w:lvl>
   </w:abstractNum>
-  <w:abstractNum w:abstractNumId="22" w15:restartNumberingAfterBreak="0">
+  <w:abstractNum w:abstractNumId="29" w15:restartNumberingAfterBreak="0">
+    <w:nsid w:val="621165A9"/>
+    <w:multiLevelType w:val="multilevel"/>
+    <w:tmpl w:val="BBE2551C"/>
+    <w:lvl w:ilvl="0">
+      <w:start w:val="1"/>
+      <w:numFmt w:val="bullet"/>
+      <w:lvlText w:val=""/>
+      <w:lvlJc w:val="left"/>
+      <w:pPr>
+        <w:tabs>
+          <w:tab w:val="num" w:pos="720"/>
+        </w:tabs>
+        <w:ind w:left="720" w:hanging="360"/>
+      </w:pPr>
+      <w:rPr>
+        <w:rFonts w:ascii="Symbol" w:hAnsi="Symbol" w:hint="default"/>
+        <w:sz w:val="20"/>
+      </w:rPr>
+    </w:lvl>
+    <w:lvl w:ilvl="1" w:tentative="1">
+      <w:start w:val="1"/>
+      <w:numFmt w:val="bullet"/>
+      <w:lvlText w:val=""/>
+      <w:lvlJc w:val="left"/>
+      <w:pPr>
+        <w:tabs>
+          <w:tab w:val="num" w:pos="1440"/>
+        </w:tabs>
+        <w:ind w:left="1440" w:hanging="360"/>
+      </w:pPr>
+      <w:rPr>
+        <w:rFonts w:ascii="Symbol" w:hAnsi="Symbol" w:hint="default"/>
+        <w:sz w:val="20"/>
+      </w:rPr>
+    </w:lvl>
+    <w:lvl w:ilvl="2" w:tentative="1">
+      <w:start w:val="1"/>
+      <w:numFmt w:val="bullet"/>
+      <w:lvlText w:val=""/>
+      <w:lvlJc w:val="left"/>
+      <w:pPr>
+        <w:tabs>
+          <w:tab w:val="num" w:pos="2160"/>
+        </w:tabs>
+        <w:ind w:left="2160" w:hanging="360"/>
+      </w:pPr>
+      <w:rPr>
+        <w:rFonts w:ascii="Symbol" w:hAnsi="Symbol" w:hint="default"/>
+        <w:sz w:val="20"/>
+      </w:rPr>
+    </w:lvl>
+    <w:lvl w:ilvl="3" w:tentative="1">
+      <w:start w:val="1"/>
+      <w:numFmt w:val="bullet"/>
+      <w:lvlText w:val=""/>
+      <w:lvlJc w:val="left"/>
+      <w:pPr>
+        <w:tabs>
+          <w:tab w:val="num" w:pos="2880"/>
+        </w:tabs>
+        <w:ind w:left="2880" w:hanging="360"/>
+      </w:pPr>
+      <w:rPr>
+        <w:rFonts w:ascii="Symbol" w:hAnsi="Symbol" w:hint="default"/>
+        <w:sz w:val="20"/>
+      </w:rPr>
+    </w:lvl>
+    <w:lvl w:ilvl="4" w:tentative="1">
+      <w:start w:val="1"/>
+      <w:numFmt w:val="bullet"/>
+      <w:lvlText w:val=""/>
+      <w:lvlJc w:val="left"/>
+      <w:pPr>
+        <w:tabs>
+          <w:tab w:val="num" w:pos="3600"/>
+        </w:tabs>
+        <w:ind w:left="3600" w:hanging="360"/>
+      </w:pPr>
+      <w:rPr>
+        <w:rFonts w:ascii="Symbol" w:hAnsi="Symbol" w:hint="default"/>
+        <w:sz w:val="20"/>
+      </w:rPr>
+    </w:lvl>
+    <w:lvl w:ilvl="5" w:tentative="1">
+      <w:start w:val="1"/>
+      <w:numFmt w:val="bullet"/>
+      <w:lvlText w:val=""/>
+      <w:lvlJc w:val="left"/>
+      <w:pPr>
+        <w:tabs>
+          <w:tab w:val="num" w:pos="4320"/>
+        </w:tabs>
+        <w:ind w:left="4320" w:hanging="360"/>
+      </w:pPr>
+      <w:rPr>
+        <w:rFonts w:ascii="Symbol" w:hAnsi="Symbol" w:hint="default"/>
+        <w:sz w:val="20"/>
+      </w:rPr>
+    </w:lvl>
+    <w:lvl w:ilvl="6" w:tentative="1">
+      <w:start w:val="1"/>
+      <w:numFmt w:val="bullet"/>
+      <w:lvlText w:val=""/>
+      <w:lvlJc w:val="left"/>
+      <w:pPr>
+        <w:tabs>
+          <w:tab w:val="num" w:pos="5040"/>
+        </w:tabs>
+        <w:ind w:left="5040" w:hanging="360"/>
+      </w:pPr>
+      <w:rPr>
+        <w:rFonts w:ascii="Symbol" w:hAnsi="Symbol" w:hint="default"/>
+        <w:sz w:val="20"/>
+      </w:rPr>
+    </w:lvl>
+    <w:lvl w:ilvl="7" w:tentative="1">
+      <w:start w:val="1"/>
+      <w:numFmt w:val="bullet"/>
+      <w:lvlText w:val=""/>
+      <w:lvlJc w:val="left"/>
+      <w:pPr>
+        <w:tabs>
+          <w:tab w:val="num" w:pos="5760"/>
+        </w:tabs>
+        <w:ind w:left="5760" w:hanging="360"/>
+      </w:pPr>
+      <w:rPr>
+        <w:rFonts w:ascii="Symbol" w:hAnsi="Symbol" w:hint="default"/>
+        <w:sz w:val="20"/>
+      </w:rPr>
+    </w:lvl>
+    <w:lvl w:ilvl="8" w:tentative="1">
+      <w:start w:val="1"/>
+      <w:numFmt w:val="bullet"/>
+      <w:lvlText w:val=""/>
+      <w:lvlJc w:val="left"/>
+      <w:pPr>
+        <w:tabs>
+          <w:tab w:val="num" w:pos="6480"/>
+        </w:tabs>
+        <w:ind w:left="6480" w:hanging="360"/>
+      </w:pPr>
+      <w:rPr>
+        <w:rFonts w:ascii="Symbol" w:hAnsi="Symbol" w:hint="default"/>
+        <w:sz w:val="20"/>
+      </w:rPr>
+    </w:lvl>
+  </w:abstractNum>
+  <w:abstractNum w:abstractNumId="30" w15:restartNumberingAfterBreak="0">
     <w:nsid w:val="63D65905"/>
     <w:multiLevelType w:val="multilevel"/>
     <w:tmpl w:val="9D16DD36"/>
@@ -9853,7 +13098,7 @@
       </w:rPr>
     </w:lvl>
   </w:abstractNum>
-  <w:abstractNum w:abstractNumId="23" w15:restartNumberingAfterBreak="0">
+  <w:abstractNum w:abstractNumId="31" w15:restartNumberingAfterBreak="0">
     <w:nsid w:val="64067C8B"/>
     <w:multiLevelType w:val="multilevel"/>
     <w:tmpl w:val="8BD03516"/>
@@ -10002,7 +13247,7 @@
       </w:rPr>
     </w:lvl>
   </w:abstractNum>
-  <w:abstractNum w:abstractNumId="24" w15:restartNumberingAfterBreak="0">
+  <w:abstractNum w:abstractNumId="32" w15:restartNumberingAfterBreak="0">
     <w:nsid w:val="65B101F8"/>
     <w:multiLevelType w:val="multilevel"/>
     <w:tmpl w:val="706667BE"/>
@@ -10151,7 +13396,7 @@
       </w:rPr>
     </w:lvl>
   </w:abstractNum>
-  <w:abstractNum w:abstractNumId="25" w15:restartNumberingAfterBreak="0">
+  <w:abstractNum w:abstractNumId="33" w15:restartNumberingAfterBreak="0">
     <w:nsid w:val="65D141C0"/>
     <w:multiLevelType w:val="multilevel"/>
     <w:tmpl w:val="4E3A9A4E"/>
@@ -10300,7 +13545,7 @@
       </w:rPr>
     </w:lvl>
   </w:abstractNum>
-  <w:abstractNum w:abstractNumId="26" w15:restartNumberingAfterBreak="0">
+  <w:abstractNum w:abstractNumId="34" w15:restartNumberingAfterBreak="0">
     <w:nsid w:val="6ED234E4"/>
     <w:multiLevelType w:val="multilevel"/>
     <w:tmpl w:val="B8E23658"/>
@@ -10449,7 +13694,305 @@
       </w:rPr>
     </w:lvl>
   </w:abstractNum>
-  <w:abstractNum w:abstractNumId="27" w15:restartNumberingAfterBreak="0">
+  <w:abstractNum w:abstractNumId="35" w15:restartNumberingAfterBreak="0">
+    <w:nsid w:val="70A11140"/>
+    <w:multiLevelType w:val="multilevel"/>
+    <w:tmpl w:val="14FC838A"/>
+    <w:lvl w:ilvl="0">
+      <w:start w:val="1"/>
+      <w:numFmt w:val="bullet"/>
+      <w:lvlText w:val=""/>
+      <w:lvlJc w:val="left"/>
+      <w:pPr>
+        <w:tabs>
+          <w:tab w:val="num" w:pos="720"/>
+        </w:tabs>
+        <w:ind w:left="720" w:hanging="360"/>
+      </w:pPr>
+      <w:rPr>
+        <w:rFonts w:ascii="Symbol" w:hAnsi="Symbol" w:hint="default"/>
+        <w:sz w:val="20"/>
+      </w:rPr>
+    </w:lvl>
+    <w:lvl w:ilvl="1" w:tentative="1">
+      <w:start w:val="1"/>
+      <w:numFmt w:val="bullet"/>
+      <w:lvlText w:val=""/>
+      <w:lvlJc w:val="left"/>
+      <w:pPr>
+        <w:tabs>
+          <w:tab w:val="num" w:pos="1440"/>
+        </w:tabs>
+        <w:ind w:left="1440" w:hanging="360"/>
+      </w:pPr>
+      <w:rPr>
+        <w:rFonts w:ascii="Symbol" w:hAnsi="Symbol" w:hint="default"/>
+        <w:sz w:val="20"/>
+      </w:rPr>
+    </w:lvl>
+    <w:lvl w:ilvl="2" w:tentative="1">
+      <w:start w:val="1"/>
+      <w:numFmt w:val="bullet"/>
+      <w:lvlText w:val=""/>
+      <w:lvlJc w:val="left"/>
+      <w:pPr>
+        <w:tabs>
+          <w:tab w:val="num" w:pos="2160"/>
+        </w:tabs>
+        <w:ind w:left="2160" w:hanging="360"/>
+      </w:pPr>
+      <w:rPr>
+        <w:rFonts w:ascii="Symbol" w:hAnsi="Symbol" w:hint="default"/>
+        <w:sz w:val="20"/>
+      </w:rPr>
+    </w:lvl>
+    <w:lvl w:ilvl="3" w:tentative="1">
+      <w:start w:val="1"/>
+      <w:numFmt w:val="bullet"/>
+      <w:lvlText w:val=""/>
+      <w:lvlJc w:val="left"/>
+      <w:pPr>
+        <w:tabs>
+          <w:tab w:val="num" w:pos="2880"/>
+        </w:tabs>
+        <w:ind w:left="2880" w:hanging="360"/>
+      </w:pPr>
+      <w:rPr>
+        <w:rFonts w:ascii="Symbol" w:hAnsi="Symbol" w:hint="default"/>
+        <w:sz w:val="20"/>
+      </w:rPr>
+    </w:lvl>
+    <w:lvl w:ilvl="4" w:tentative="1">
+      <w:start w:val="1"/>
+      <w:numFmt w:val="bullet"/>
+      <w:lvlText w:val=""/>
+      <w:lvlJc w:val="left"/>
+      <w:pPr>
+        <w:tabs>
+          <w:tab w:val="num" w:pos="3600"/>
+        </w:tabs>
+        <w:ind w:left="3600" w:hanging="360"/>
+      </w:pPr>
+      <w:rPr>
+        <w:rFonts w:ascii="Symbol" w:hAnsi="Symbol" w:hint="default"/>
+        <w:sz w:val="20"/>
+      </w:rPr>
+    </w:lvl>
+    <w:lvl w:ilvl="5" w:tentative="1">
+      <w:start w:val="1"/>
+      <w:numFmt w:val="bullet"/>
+      <w:lvlText w:val=""/>
+      <w:lvlJc w:val="left"/>
+      <w:pPr>
+        <w:tabs>
+          <w:tab w:val="num" w:pos="4320"/>
+        </w:tabs>
+        <w:ind w:left="4320" w:hanging="360"/>
+      </w:pPr>
+      <w:rPr>
+        <w:rFonts w:ascii="Symbol" w:hAnsi="Symbol" w:hint="default"/>
+        <w:sz w:val="20"/>
+      </w:rPr>
+    </w:lvl>
+    <w:lvl w:ilvl="6" w:tentative="1">
+      <w:start w:val="1"/>
+      <w:numFmt w:val="bullet"/>
+      <w:lvlText w:val=""/>
+      <w:lvlJc w:val="left"/>
+      <w:pPr>
+        <w:tabs>
+          <w:tab w:val="num" w:pos="5040"/>
+        </w:tabs>
+        <w:ind w:left="5040" w:hanging="360"/>
+      </w:pPr>
+      <w:rPr>
+        <w:rFonts w:ascii="Symbol" w:hAnsi="Symbol" w:hint="default"/>
+        <w:sz w:val="20"/>
+      </w:rPr>
+    </w:lvl>
+    <w:lvl w:ilvl="7" w:tentative="1">
+      <w:start w:val="1"/>
+      <w:numFmt w:val="bullet"/>
+      <w:lvlText w:val=""/>
+      <w:lvlJc w:val="left"/>
+      <w:pPr>
+        <w:tabs>
+          <w:tab w:val="num" w:pos="5760"/>
+        </w:tabs>
+        <w:ind w:left="5760" w:hanging="360"/>
+      </w:pPr>
+      <w:rPr>
+        <w:rFonts w:ascii="Symbol" w:hAnsi="Symbol" w:hint="default"/>
+        <w:sz w:val="20"/>
+      </w:rPr>
+    </w:lvl>
+    <w:lvl w:ilvl="8" w:tentative="1">
+      <w:start w:val="1"/>
+      <w:numFmt w:val="bullet"/>
+      <w:lvlText w:val=""/>
+      <w:lvlJc w:val="left"/>
+      <w:pPr>
+        <w:tabs>
+          <w:tab w:val="num" w:pos="6480"/>
+        </w:tabs>
+        <w:ind w:left="6480" w:hanging="360"/>
+      </w:pPr>
+      <w:rPr>
+        <w:rFonts w:ascii="Symbol" w:hAnsi="Symbol" w:hint="default"/>
+        <w:sz w:val="20"/>
+      </w:rPr>
+    </w:lvl>
+  </w:abstractNum>
+  <w:abstractNum w:abstractNumId="36" w15:restartNumberingAfterBreak="0">
+    <w:nsid w:val="76A30E7E"/>
+    <w:multiLevelType w:val="multilevel"/>
+    <w:tmpl w:val="44FA9938"/>
+    <w:lvl w:ilvl="0">
+      <w:start w:val="1"/>
+      <w:numFmt w:val="bullet"/>
+      <w:lvlText w:val=""/>
+      <w:lvlJc w:val="left"/>
+      <w:pPr>
+        <w:tabs>
+          <w:tab w:val="num" w:pos="720"/>
+        </w:tabs>
+        <w:ind w:left="720" w:hanging="360"/>
+      </w:pPr>
+      <w:rPr>
+        <w:rFonts w:ascii="Symbol" w:hAnsi="Symbol" w:hint="default"/>
+        <w:sz w:val="20"/>
+      </w:rPr>
+    </w:lvl>
+    <w:lvl w:ilvl="1" w:tentative="1">
+      <w:start w:val="1"/>
+      <w:numFmt w:val="bullet"/>
+      <w:lvlText w:val=""/>
+      <w:lvlJc w:val="left"/>
+      <w:pPr>
+        <w:tabs>
+          <w:tab w:val="num" w:pos="1440"/>
+        </w:tabs>
+        <w:ind w:left="1440" w:hanging="360"/>
+      </w:pPr>
+      <w:rPr>
+        <w:rFonts w:ascii="Symbol" w:hAnsi="Symbol" w:hint="default"/>
+        <w:sz w:val="20"/>
+      </w:rPr>
+    </w:lvl>
+    <w:lvl w:ilvl="2" w:tentative="1">
+      <w:start w:val="1"/>
+      <w:numFmt w:val="bullet"/>
+      <w:lvlText w:val=""/>
+      <w:lvlJc w:val="left"/>
+      <w:pPr>
+        <w:tabs>
+          <w:tab w:val="num" w:pos="2160"/>
+        </w:tabs>
+        <w:ind w:left="2160" w:hanging="360"/>
+      </w:pPr>
+      <w:rPr>
+        <w:rFonts w:ascii="Symbol" w:hAnsi="Symbol" w:hint="default"/>
+        <w:sz w:val="20"/>
+      </w:rPr>
+    </w:lvl>
+    <w:lvl w:ilvl="3" w:tentative="1">
+      <w:start w:val="1"/>
+      <w:numFmt w:val="bullet"/>
+      <w:lvlText w:val=""/>
+      <w:lvlJc w:val="left"/>
+      <w:pPr>
+        <w:tabs>
+          <w:tab w:val="num" w:pos="2880"/>
+        </w:tabs>
+        <w:ind w:left="2880" w:hanging="360"/>
+      </w:pPr>
+      <w:rPr>
+        <w:rFonts w:ascii="Symbol" w:hAnsi="Symbol" w:hint="default"/>
+        <w:sz w:val="20"/>
+      </w:rPr>
+    </w:lvl>
+    <w:lvl w:ilvl="4" w:tentative="1">
+      <w:start w:val="1"/>
+      <w:numFmt w:val="bullet"/>
+      <w:lvlText w:val=""/>
+      <w:lvlJc w:val="left"/>
+      <w:pPr>
+        <w:tabs>
+          <w:tab w:val="num" w:pos="3600"/>
+        </w:tabs>
+        <w:ind w:left="3600" w:hanging="360"/>
+      </w:pPr>
+      <w:rPr>
+        <w:rFonts w:ascii="Symbol" w:hAnsi="Symbol" w:hint="default"/>
+        <w:sz w:val="20"/>
+      </w:rPr>
+    </w:lvl>
+    <w:lvl w:ilvl="5" w:tentative="1">
+      <w:start w:val="1"/>
+      <w:numFmt w:val="bullet"/>
+      <w:lvlText w:val=""/>
+      <w:lvlJc w:val="left"/>
+      <w:pPr>
+        <w:tabs>
+          <w:tab w:val="num" w:pos="4320"/>
+        </w:tabs>
+        <w:ind w:left="4320" w:hanging="360"/>
+      </w:pPr>
+      <w:rPr>
+        <w:rFonts w:ascii="Symbol" w:hAnsi="Symbol" w:hint="default"/>
+        <w:sz w:val="20"/>
+      </w:rPr>
+    </w:lvl>
+    <w:lvl w:ilvl="6" w:tentative="1">
+      <w:start w:val="1"/>
+      <w:numFmt w:val="bullet"/>
+      <w:lvlText w:val=""/>
+      <w:lvlJc w:val="left"/>
+      <w:pPr>
+        <w:tabs>
+          <w:tab w:val="num" w:pos="5040"/>
+        </w:tabs>
+        <w:ind w:left="5040" w:hanging="360"/>
+      </w:pPr>
+      <w:rPr>
+        <w:rFonts w:ascii="Symbol" w:hAnsi="Symbol" w:hint="default"/>
+        <w:sz w:val="20"/>
+      </w:rPr>
+    </w:lvl>
+    <w:lvl w:ilvl="7" w:tentative="1">
+      <w:start w:val="1"/>
+      <w:numFmt w:val="bullet"/>
+      <w:lvlText w:val=""/>
+      <w:lvlJc w:val="left"/>
+      <w:pPr>
+        <w:tabs>
+          <w:tab w:val="num" w:pos="5760"/>
+        </w:tabs>
+        <w:ind w:left="5760" w:hanging="360"/>
+      </w:pPr>
+      <w:rPr>
+        <w:rFonts w:ascii="Symbol" w:hAnsi="Symbol" w:hint="default"/>
+        <w:sz w:val="20"/>
+      </w:rPr>
+    </w:lvl>
+    <w:lvl w:ilvl="8" w:tentative="1">
+      <w:start w:val="1"/>
+      <w:numFmt w:val="bullet"/>
+      <w:lvlText w:val=""/>
+      <w:lvlJc w:val="left"/>
+      <w:pPr>
+        <w:tabs>
+          <w:tab w:val="num" w:pos="6480"/>
+        </w:tabs>
+        <w:ind w:left="6480" w:hanging="360"/>
+      </w:pPr>
+      <w:rPr>
+        <w:rFonts w:ascii="Symbol" w:hAnsi="Symbol" w:hint="default"/>
+        <w:sz w:val="20"/>
+      </w:rPr>
+    </w:lvl>
+  </w:abstractNum>
+  <w:abstractNum w:abstractNumId="37" w15:restartNumberingAfterBreak="0">
     <w:nsid w:val="79003B50"/>
     <w:multiLevelType w:val="multilevel"/>
     <w:tmpl w:val="6F30E37C"/>
@@ -10598,7 +14141,7 @@
       </w:rPr>
     </w:lvl>
   </w:abstractNum>
-  <w:abstractNum w:abstractNumId="28" w15:restartNumberingAfterBreak="0">
+  <w:abstractNum w:abstractNumId="38" w15:restartNumberingAfterBreak="0">
     <w:nsid w:val="7A067FF2"/>
     <w:multiLevelType w:val="multilevel"/>
     <w:tmpl w:val="8738DA7A"/>
@@ -10747,7 +14290,7 @@
       </w:rPr>
     </w:lvl>
   </w:abstractNum>
-  <w:abstractNum w:abstractNumId="29" w15:restartNumberingAfterBreak="0">
+  <w:abstractNum w:abstractNumId="39" w15:restartNumberingAfterBreak="0">
     <w:nsid w:val="7A9C7FA4"/>
     <w:multiLevelType w:val="multilevel"/>
     <w:tmpl w:val="F4D414CC"/>
@@ -10896,7 +14439,156 @@
       </w:rPr>
     </w:lvl>
   </w:abstractNum>
-  <w:abstractNum w:abstractNumId="30" w15:restartNumberingAfterBreak="0">
+  <w:abstractNum w:abstractNumId="40" w15:restartNumberingAfterBreak="0">
+    <w:nsid w:val="7B0834D4"/>
+    <w:multiLevelType w:val="multilevel"/>
+    <w:tmpl w:val="AE3CA11C"/>
+    <w:lvl w:ilvl="0">
+      <w:start w:val="1"/>
+      <w:numFmt w:val="bullet"/>
+      <w:lvlText w:val=""/>
+      <w:lvlJc w:val="left"/>
+      <w:pPr>
+        <w:tabs>
+          <w:tab w:val="num" w:pos="720"/>
+        </w:tabs>
+        <w:ind w:left="720" w:hanging="360"/>
+      </w:pPr>
+      <w:rPr>
+        <w:rFonts w:ascii="Symbol" w:hAnsi="Symbol" w:hint="default"/>
+        <w:sz w:val="20"/>
+      </w:rPr>
+    </w:lvl>
+    <w:lvl w:ilvl="1" w:tentative="1">
+      <w:start w:val="1"/>
+      <w:numFmt w:val="bullet"/>
+      <w:lvlText w:val=""/>
+      <w:lvlJc w:val="left"/>
+      <w:pPr>
+        <w:tabs>
+          <w:tab w:val="num" w:pos="1440"/>
+        </w:tabs>
+        <w:ind w:left="1440" w:hanging="360"/>
+      </w:pPr>
+      <w:rPr>
+        <w:rFonts w:ascii="Symbol" w:hAnsi="Symbol" w:hint="default"/>
+        <w:sz w:val="20"/>
+      </w:rPr>
+    </w:lvl>
+    <w:lvl w:ilvl="2" w:tentative="1">
+      <w:start w:val="1"/>
+      <w:numFmt w:val="bullet"/>
+      <w:lvlText w:val=""/>
+      <w:lvlJc w:val="left"/>
+      <w:pPr>
+        <w:tabs>
+          <w:tab w:val="num" w:pos="2160"/>
+        </w:tabs>
+        <w:ind w:left="2160" w:hanging="360"/>
+      </w:pPr>
+      <w:rPr>
+        <w:rFonts w:ascii="Symbol" w:hAnsi="Symbol" w:hint="default"/>
+        <w:sz w:val="20"/>
+      </w:rPr>
+    </w:lvl>
+    <w:lvl w:ilvl="3" w:tentative="1">
+      <w:start w:val="1"/>
+      <w:numFmt w:val="bullet"/>
+      <w:lvlText w:val=""/>
+      <w:lvlJc w:val="left"/>
+      <w:pPr>
+        <w:tabs>
+          <w:tab w:val="num" w:pos="2880"/>
+        </w:tabs>
+        <w:ind w:left="2880" w:hanging="360"/>
+      </w:pPr>
+      <w:rPr>
+        <w:rFonts w:ascii="Symbol" w:hAnsi="Symbol" w:hint="default"/>
+        <w:sz w:val="20"/>
+      </w:rPr>
+    </w:lvl>
+    <w:lvl w:ilvl="4" w:tentative="1">
+      <w:start w:val="1"/>
+      <w:numFmt w:val="bullet"/>
+      <w:lvlText w:val=""/>
+      <w:lvlJc w:val="left"/>
+      <w:pPr>
+        <w:tabs>
+          <w:tab w:val="num" w:pos="3600"/>
+        </w:tabs>
+        <w:ind w:left="3600" w:hanging="360"/>
+      </w:pPr>
+      <w:rPr>
+        <w:rFonts w:ascii="Symbol" w:hAnsi="Symbol" w:hint="default"/>
+        <w:sz w:val="20"/>
+      </w:rPr>
+    </w:lvl>
+    <w:lvl w:ilvl="5" w:tentative="1">
+      <w:start w:val="1"/>
+      <w:numFmt w:val="bullet"/>
+      <w:lvlText w:val=""/>
+      <w:lvlJc w:val="left"/>
+      <w:pPr>
+        <w:tabs>
+          <w:tab w:val="num" w:pos="4320"/>
+        </w:tabs>
+        <w:ind w:left="4320" w:hanging="360"/>
+      </w:pPr>
+      <w:rPr>
+        <w:rFonts w:ascii="Symbol" w:hAnsi="Symbol" w:hint="default"/>
+        <w:sz w:val="20"/>
+      </w:rPr>
+    </w:lvl>
+    <w:lvl w:ilvl="6" w:tentative="1">
+      <w:start w:val="1"/>
+      <w:numFmt w:val="bullet"/>
+      <w:lvlText w:val=""/>
+      <w:lvlJc w:val="left"/>
+      <w:pPr>
+        <w:tabs>
+          <w:tab w:val="num" w:pos="5040"/>
+        </w:tabs>
+        <w:ind w:left="5040" w:hanging="360"/>
+      </w:pPr>
+      <w:rPr>
+        <w:rFonts w:ascii="Symbol" w:hAnsi="Symbol" w:hint="default"/>
+        <w:sz w:val="20"/>
+      </w:rPr>
+    </w:lvl>
+    <w:lvl w:ilvl="7" w:tentative="1">
+      <w:start w:val="1"/>
+      <w:numFmt w:val="bullet"/>
+      <w:lvlText w:val=""/>
+      <w:lvlJc w:val="left"/>
+      <w:pPr>
+        <w:tabs>
+          <w:tab w:val="num" w:pos="5760"/>
+        </w:tabs>
+        <w:ind w:left="5760" w:hanging="360"/>
+      </w:pPr>
+      <w:rPr>
+        <w:rFonts w:ascii="Symbol" w:hAnsi="Symbol" w:hint="default"/>
+        <w:sz w:val="20"/>
+      </w:rPr>
+    </w:lvl>
+    <w:lvl w:ilvl="8" w:tentative="1">
+      <w:start w:val="1"/>
+      <w:numFmt w:val="bullet"/>
+      <w:lvlText w:val=""/>
+      <w:lvlJc w:val="left"/>
+      <w:pPr>
+        <w:tabs>
+          <w:tab w:val="num" w:pos="6480"/>
+        </w:tabs>
+        <w:ind w:left="6480" w:hanging="360"/>
+      </w:pPr>
+      <w:rPr>
+        <w:rFonts w:ascii="Symbol" w:hAnsi="Symbol" w:hint="default"/>
+        <w:sz w:val="20"/>
+      </w:rPr>
+    </w:lvl>
+  </w:abstractNum>
+  <w:abstractNum w:abstractNumId="41" w15:restartNumberingAfterBreak="0">
     <w:nsid w:val="7B0B1F11"/>
     <w:multiLevelType w:val="multilevel"/>
     <w:tmpl w:val="076E82EE"/>
@@ -11045,7 +14737,7 @@
       </w:rPr>
     </w:lvl>
   </w:abstractNum>
-  <w:abstractNum w:abstractNumId="31" w15:restartNumberingAfterBreak="0">
+  <w:abstractNum w:abstractNumId="42" w15:restartNumberingAfterBreak="0">
     <w:nsid w:val="7E3E720E"/>
     <w:multiLevelType w:val="multilevel"/>
     <w:tmpl w:val="9872B5DA"/>
@@ -11195,100 +14887,133 @@
     </w:lvl>
   </w:abstractNum>
   <w:num w:numId="1" w16cid:durableId="17390422">
-    <w:abstractNumId w:val="22"/>
+    <w:abstractNumId w:val="30"/>
   </w:num>
   <w:num w:numId="2" w16cid:durableId="1065838657">
-    <w:abstractNumId w:val="11"/>
+    <w:abstractNumId w:val="15"/>
   </w:num>
   <w:num w:numId="3" w16cid:durableId="1072780345">
-    <w:abstractNumId w:val="19"/>
+    <w:abstractNumId w:val="26"/>
   </w:num>
   <w:num w:numId="4" w16cid:durableId="446390739">
+    <w:abstractNumId w:val="23"/>
+  </w:num>
+  <w:num w:numId="5" w16cid:durableId="96172779">
     <w:abstractNumId w:val="17"/>
   </w:num>
-  <w:num w:numId="5" w16cid:durableId="96172779">
-    <w:abstractNumId w:val="13"/>
-  </w:num>
   <w:num w:numId="6" w16cid:durableId="1985235937">
-    <w:abstractNumId w:val="23"/>
+    <w:abstractNumId w:val="31"/>
   </w:num>
   <w:num w:numId="7" w16cid:durableId="1760369965">
-    <w:abstractNumId w:val="21"/>
+    <w:abstractNumId w:val="28"/>
   </w:num>
   <w:num w:numId="8" w16cid:durableId="1672567567">
     <w:abstractNumId w:val="2"/>
   </w:num>
   <w:num w:numId="9" w16cid:durableId="2108452961">
-    <w:abstractNumId w:val="10"/>
+    <w:abstractNumId w:val="13"/>
   </w:num>
   <w:num w:numId="10" w16cid:durableId="1960187365">
-    <w:abstractNumId w:val="3"/>
+    <w:abstractNumId w:val="5"/>
   </w:num>
   <w:num w:numId="11" w16cid:durableId="927226692">
-    <w:abstractNumId w:val="9"/>
+    <w:abstractNumId w:val="12"/>
   </w:num>
   <w:num w:numId="12" w16cid:durableId="1040861380">
-    <w:abstractNumId w:val="4"/>
+    <w:abstractNumId w:val="6"/>
   </w:num>
   <w:num w:numId="13" w16cid:durableId="1237088824">
-    <w:abstractNumId w:val="20"/>
+    <w:abstractNumId w:val="27"/>
   </w:num>
   <w:num w:numId="14" w16cid:durableId="1424181612">
-    <w:abstractNumId w:val="6"/>
+    <w:abstractNumId w:val="8"/>
   </w:num>
   <w:num w:numId="15" w16cid:durableId="620772048">
-    <w:abstractNumId w:val="26"/>
+    <w:abstractNumId w:val="34"/>
   </w:num>
   <w:num w:numId="16" w16cid:durableId="1761099235">
     <w:abstractNumId w:val="0"/>
   </w:num>
   <w:num w:numId="17" w16cid:durableId="20322253">
-    <w:abstractNumId w:val="28"/>
+    <w:abstractNumId w:val="38"/>
   </w:num>
   <w:num w:numId="18" w16cid:durableId="1191801646">
-    <w:abstractNumId w:val="8"/>
+    <w:abstractNumId w:val="11"/>
   </w:num>
   <w:num w:numId="19" w16cid:durableId="623461311">
-    <w:abstractNumId w:val="12"/>
+    <w:abstractNumId w:val="16"/>
   </w:num>
   <w:num w:numId="20" w16cid:durableId="439761302">
-    <w:abstractNumId w:val="5"/>
+    <w:abstractNumId w:val="7"/>
   </w:num>
   <w:num w:numId="21" w16cid:durableId="655039512">
-    <w:abstractNumId w:val="30"/>
+    <w:abstractNumId w:val="41"/>
   </w:num>
   <w:num w:numId="22" w16cid:durableId="1239436197">
     <w:abstractNumId w:val="1"/>
   </w:num>
   <w:num w:numId="23" w16cid:durableId="1911574117">
-    <w:abstractNumId w:val="15"/>
+    <w:abstractNumId w:val="21"/>
   </w:num>
   <w:num w:numId="24" w16cid:durableId="1489908378">
-    <w:abstractNumId w:val="16"/>
+    <w:abstractNumId w:val="22"/>
   </w:num>
   <w:num w:numId="25" w16cid:durableId="1965041461">
-    <w:abstractNumId w:val="31"/>
+    <w:abstractNumId w:val="42"/>
   </w:num>
   <w:num w:numId="26" w16cid:durableId="80838480">
+    <w:abstractNumId w:val="33"/>
+  </w:num>
+  <w:num w:numId="27" w16cid:durableId="487719726">
+    <w:abstractNumId w:val="39"/>
+  </w:num>
+  <w:num w:numId="28" w16cid:durableId="624627585">
+    <w:abstractNumId w:val="10"/>
+  </w:num>
+  <w:num w:numId="29" w16cid:durableId="1432581677">
+    <w:abstractNumId w:val="37"/>
+  </w:num>
+  <w:num w:numId="30" w16cid:durableId="859666952">
+    <w:abstractNumId w:val="32"/>
+  </w:num>
+  <w:num w:numId="31" w16cid:durableId="1354695197">
+    <w:abstractNumId w:val="24"/>
+  </w:num>
+  <w:num w:numId="32" w16cid:durableId="773401456">
+    <w:abstractNumId w:val="18"/>
+  </w:num>
+  <w:num w:numId="33" w16cid:durableId="1023748869">
+    <w:abstractNumId w:val="14"/>
+  </w:num>
+  <w:num w:numId="34" w16cid:durableId="402797809">
+    <w:abstractNumId w:val="9"/>
+  </w:num>
+  <w:num w:numId="35" w16cid:durableId="1143231866">
+    <w:abstractNumId w:val="19"/>
+  </w:num>
+  <w:num w:numId="36" w16cid:durableId="220943965">
+    <w:abstractNumId w:val="40"/>
+  </w:num>
+  <w:num w:numId="37" w16cid:durableId="2088769416">
+    <w:abstractNumId w:val="3"/>
+  </w:num>
+  <w:num w:numId="38" w16cid:durableId="1109200024">
+    <w:abstractNumId w:val="36"/>
+  </w:num>
+  <w:num w:numId="39" w16cid:durableId="1500609690">
     <w:abstractNumId w:val="25"/>
   </w:num>
-  <w:num w:numId="27" w16cid:durableId="487719726">
+  <w:num w:numId="40" w16cid:durableId="1812668256">
+    <w:abstractNumId w:val="35"/>
+  </w:num>
+  <w:num w:numId="41" w16cid:durableId="1464887238">
     <w:abstractNumId w:val="29"/>
   </w:num>
-  <w:num w:numId="28" w16cid:durableId="624627585">
-    <w:abstractNumId w:val="7"/>
+  <w:num w:numId="42" w16cid:durableId="713576377">
+    <w:abstractNumId w:val="4"/>
   </w:num>
-  <w:num w:numId="29" w16cid:durableId="1432581677">
-    <w:abstractNumId w:val="27"/>
-  </w:num>
-  <w:num w:numId="30" w16cid:durableId="859666952">
-    <w:abstractNumId w:val="24"/>
-  </w:num>
-  <w:num w:numId="31" w16cid:durableId="1354695197">
-    <w:abstractNumId w:val="18"/>
-  </w:num>
-  <w:num w:numId="32" w16cid:durableId="773401456">
-    <w:abstractNumId w:val="14"/>
+  <w:num w:numId="43" w16cid:durableId="198202380">
+    <w:abstractNumId w:val="20"/>
   </w:num>
 </w:numbering>
 </file>
@@ -11896,6 +15621,7 @@
   <w:style w:type="character" w:default="1" w:styleId="DefaultParagraphFont">
     <w:name w:val="Default Paragraph Font"/>
     <w:uiPriority w:val="1"/>
+    <w:semiHidden/>
     <w:unhideWhenUsed/>
   </w:style>
   <w:style w:type="table" w:default="1" w:styleId="TableNormal">

</xml_diff>

<commit_message>
Enhance compute workers Kafka consumer resilience and fix EV telemetry parsing
- Update kafka_consumer.py with auto-restart on consumer loop crash and adjusted timeout parameters
- Fix main.py to handle nested 'position' and 'target' structures in EV telemetry messages
- Enable django.contrib.auth and contenttypes in Django settings.py
- Add temporary Office files to .gitignore
</commit_message>
<xml_diff>
--- a/project.docx
+++ b/project.docx
@@ -8539,6 +8539,12 @@
         <w:t>*   `.\run.bat clean` - Completely stops and removes all containers, volumes, and networks if you want to start fresh.</w:t>
       </w:r>
     </w:p>
+    <w:p/>
+    <w:p>
+      <w:r>
+        <w:t>docker compose up --build dashboard</w:t>
+      </w:r>
+    </w:p>
     <w:sectPr>
       <w:pgSz w:w="11906" w:h="16838"/>
       <w:pgMar w:top="1440" w:right="1440" w:bottom="1440" w:left="1440" w:header="708" w:footer="708" w:gutter="0"/>
@@ -15621,7 +15627,6 @@
   <w:style w:type="character" w:default="1" w:styleId="DefaultParagraphFont">
     <w:name w:val="Default Paragraph Font"/>
     <w:uiPriority w:val="1"/>
-    <w:semiHidden/>
     <w:unhideWhenUsed/>
   </w:style>
   <w:style w:type="table" w:default="1" w:styleId="TableNormal">

</xml_diff>